<commit_message>
Add new files and  remake old
</commit_message>
<xml_diff>
--- a/Эксп.техн.ср.движ.поездов_(Фадеев_К.С.)/Курсавая.docx
+++ b/Эксп.техн.ср.движ.поездов_(Фадеев_К.С.)/Курсавая.docx
@@ -61,35 +61,19 @@
         </w:rPr>
         <w:t>(</w:t>
       </w:r>
-      <w:proofErr w:type="spellStart"/>
       <w:proofErr w:type="gramStart"/>
       <w:r>
         <w:rPr>
           <w:color w:val="000000"/>
         </w:rPr>
-        <w:t>ОмГУПС</w:t>
+        <w:t>ОмГУПС(</w:t>
       </w:r>
-      <w:proofErr w:type="spellEnd"/>
-      <w:r>
-        <w:rPr>
-          <w:color w:val="000000"/>
-        </w:rPr>
-        <w:t>(</w:t>
-      </w:r>
-      <w:proofErr w:type="spellStart"/>
       <w:proofErr w:type="gramEnd"/>
       <w:r>
         <w:rPr>
           <w:color w:val="000000"/>
         </w:rPr>
-        <w:t>ОмИИТ</w:t>
-      </w:r>
-      <w:proofErr w:type="spellEnd"/>
-      <w:r>
-        <w:rPr>
-          <w:color w:val="000000"/>
-        </w:rPr>
-        <w:t>))</w:t>
+        <w:t>ОмИИТ))</w:t>
       </w:r>
     </w:p>
     <w:p>
@@ -159,19 +143,11 @@
           <w:color w:val="000000"/>
         </w:rPr>
       </w:pPr>
-      <w:proofErr w:type="spellStart"/>
       <w:r>
         <w:rPr>
           <w:color w:val="000000"/>
         </w:rPr>
-        <w:t>Студену</w:t>
-      </w:r>
-      <w:proofErr w:type="spellEnd"/>
-      <w:r>
-        <w:rPr>
-          <w:color w:val="000000"/>
-        </w:rPr>
-        <w:t xml:space="preserve"> группы_____</w:t>
+        <w:t>Студену группы_____</w:t>
       </w:r>
       <w:r>
         <w:rPr>
@@ -225,7 +201,6 @@
         <w:jc w:val="center"/>
         <w:rPr>
           <w:color w:val="000000"/>
-          <w:lang w:val="en-US"/>
         </w:rPr>
       </w:pPr>
       <w:r>
@@ -240,7 +215,6 @@
         <w:jc w:val="center"/>
         <w:rPr>
           <w:color w:val="000000"/>
-          <w:lang w:val="en-US"/>
         </w:rPr>
       </w:pPr>
     </w:p>
@@ -322,6 +296,745 @@
         </w:drawing>
       </w:r>
     </w:p>
+    <w:tbl>
+      <w:tblPr>
+        <w:tblStyle w:val="TableGrid"/>
+        <w:tblpPr w:leftFromText="180" w:rightFromText="180" w:vertAnchor="page" w:horzAnchor="margin" w:tblpY="8065"/>
+        <w:tblW w:w="0" w:type="auto"/>
+        <w:tblLook w:val="04A0" w:firstRow="1" w:lastRow="0" w:firstColumn="1" w:lastColumn="0" w:noHBand="0" w:noVBand="1"/>
+      </w:tblPr>
+      <w:tblGrid>
+        <w:gridCol w:w="3705"/>
+        <w:gridCol w:w="2941"/>
+        <w:gridCol w:w="2370"/>
+      </w:tblGrid>
+      <w:tr>
+        <w:tc>
+          <w:tcPr>
+            <w:tcW w:w="3705" w:type="dxa"/>
+            <w:vMerge w:val="restart"/>
+          </w:tcPr>
+          <w:p>
+            <w:pPr>
+              <w:jc w:val="center"/>
+              <w:rPr>
+                <w:sz w:val="28"/>
+                <w:szCs w:val="28"/>
+              </w:rPr>
+            </w:pPr>
+            <w:r>
+              <w:rPr>
+                <w:sz w:val="28"/>
+                <w:szCs w:val="28"/>
+              </w:rPr>
+              <w:t>Обслуживание устройства цифровая</w:t>
+            </w:r>
+          </w:p>
+        </w:tc>
+        <w:tc>
+          <w:tcPr>
+            <w:tcW w:w="2941" w:type="dxa"/>
+          </w:tcPr>
+          <w:p>
+            <w:pPr>
+              <w:jc w:val="center"/>
+              <w:rPr>
+                <w:sz w:val="28"/>
+                <w:szCs w:val="28"/>
+              </w:rPr>
+            </w:pPr>
+            <w:r>
+              <w:rPr>
+                <w:sz w:val="28"/>
+                <w:szCs w:val="28"/>
+              </w:rPr>
+              <w:t>Цифра &lt;&lt;</w:t>
+            </w:r>
+            <w:r>
+              <w:rPr>
+                <w:sz w:val="28"/>
+                <w:szCs w:val="28"/>
+                <w:lang w:val="en-US"/>
+              </w:rPr>
+              <w:t>y</w:t>
+            </w:r>
+            <w:r>
+              <w:rPr>
+                <w:sz w:val="28"/>
+                <w:szCs w:val="28"/>
+              </w:rPr>
+              <w:t>&gt;&gt; в номере варианта</w:t>
+            </w:r>
+          </w:p>
+        </w:tc>
+        <w:tc>
+          <w:tcPr>
+            <w:tcW w:w="2370" w:type="dxa"/>
+            <w:shd w:val="clear" w:color="auto" w:fill="E7E6E6" w:themeFill="background2"/>
+          </w:tcPr>
+          <w:p>
+            <w:pPr>
+              <w:jc w:val="center"/>
+              <w:rPr>
+                <w:sz w:val="28"/>
+                <w:szCs w:val="28"/>
+              </w:rPr>
+            </w:pPr>
+            <w:r>
+              <w:rPr>
+                <w:sz w:val="28"/>
+                <w:szCs w:val="28"/>
+              </w:rPr>
+              <w:t>Значения для филиал</w:t>
+            </w:r>
+          </w:p>
+        </w:tc>
+      </w:tr>
+      <w:tr>
+        <w:tc>
+          <w:tcPr>
+            <w:tcW w:w="3705" w:type="dxa"/>
+            <w:vMerge/>
+          </w:tcPr>
+          <w:p>
+            <w:pPr>
+              <w:jc w:val="center"/>
+              <w:rPr>
+                <w:sz w:val="28"/>
+                <w:szCs w:val="28"/>
+              </w:rPr>
+            </w:pPr>
+          </w:p>
+        </w:tc>
+        <w:tc>
+          <w:tcPr>
+            <w:tcW w:w="2941" w:type="dxa"/>
+          </w:tcPr>
+          <w:p>
+            <w:pPr>
+              <w:jc w:val="center"/>
+              <w:rPr>
+                <w:sz w:val="28"/>
+                <w:szCs w:val="28"/>
+              </w:rPr>
+            </w:pPr>
+            <w:r>
+              <w:rPr>
+                <w:sz w:val="28"/>
+                <w:szCs w:val="28"/>
+              </w:rPr>
+              <w:t>7</w:t>
+            </w:r>
+          </w:p>
+        </w:tc>
+        <w:tc>
+          <w:tcPr>
+            <w:tcW w:w="2370" w:type="dxa"/>
+            <w:shd w:val="clear" w:color="auto" w:fill="E7E6E6" w:themeFill="background2"/>
+          </w:tcPr>
+          <w:p>
+            <w:pPr>
+              <w:jc w:val="center"/>
+              <w:rPr>
+                <w:sz w:val="28"/>
+                <w:szCs w:val="28"/>
+              </w:rPr>
+            </w:pPr>
+            <w:r>
+              <w:rPr>
+                <w:sz w:val="28"/>
+                <w:szCs w:val="28"/>
+              </w:rPr>
+              <w:t>7</w:t>
+            </w:r>
+          </w:p>
+        </w:tc>
+      </w:tr>
+      <w:tr>
+        <w:tc>
+          <w:tcPr>
+            <w:tcW w:w="3705" w:type="dxa"/>
+          </w:tcPr>
+          <w:p>
+            <w:pPr>
+              <w:jc w:val="center"/>
+              <w:rPr>
+                <w:sz w:val="28"/>
+                <w:szCs w:val="28"/>
+                <w:lang w:val="en-US"/>
+              </w:rPr>
+            </w:pPr>
+            <w:r>
+              <w:rPr>
+                <w:sz w:val="28"/>
+                <w:szCs w:val="28"/>
+                <w:lang w:val="en-US"/>
+              </w:rPr>
+              <w:t>1</w:t>
+            </w:r>
+          </w:p>
+        </w:tc>
+        <w:tc>
+          <w:tcPr>
+            <w:tcW w:w="2941" w:type="dxa"/>
+          </w:tcPr>
+          <w:p>
+            <w:pPr>
+              <w:jc w:val="center"/>
+              <w:rPr>
+                <w:sz w:val="28"/>
+                <w:szCs w:val="28"/>
+              </w:rPr>
+            </w:pPr>
+            <w:r>
+              <w:rPr>
+                <w:sz w:val="28"/>
+                <w:szCs w:val="28"/>
+              </w:rPr>
+              <w:t>8</w:t>
+            </w:r>
+          </w:p>
+        </w:tc>
+        <w:tc>
+          <w:tcPr>
+            <w:tcW w:w="2370" w:type="dxa"/>
+            <w:shd w:val="clear" w:color="auto" w:fill="E7E6E6" w:themeFill="background2"/>
+          </w:tcPr>
+          <w:p>
+            <w:pPr>
+              <w:jc w:val="center"/>
+              <w:rPr>
+                <w:sz w:val="28"/>
+                <w:szCs w:val="28"/>
+              </w:rPr>
+            </w:pPr>
+            <w:r>
+              <w:rPr>
+                <w:sz w:val="28"/>
+                <w:szCs w:val="28"/>
+              </w:rPr>
+              <w:t>8</w:t>
+            </w:r>
+          </w:p>
+        </w:tc>
+      </w:tr>
+      <w:tr>
+        <w:tc>
+          <w:tcPr>
+            <w:tcW w:w="9016" w:type="dxa"/>
+            <w:gridSpan w:val="3"/>
+          </w:tcPr>
+          <w:p>
+            <w:pPr>
+              <w:jc w:val="center"/>
+              <w:rPr>
+                <w:sz w:val="28"/>
+                <w:szCs w:val="28"/>
+              </w:rPr>
+            </w:pPr>
+            <w:r>
+              <w:rPr>
+                <w:sz w:val="28"/>
+                <w:szCs w:val="28"/>
+              </w:rPr>
+              <w:t>Устройства проводной связи</w:t>
+            </w:r>
+          </w:p>
+        </w:tc>
+      </w:tr>
+      <w:tr>
+        <w:tc>
+          <w:tcPr>
+            <w:tcW w:w="3705" w:type="dxa"/>
+          </w:tcPr>
+          <w:p>
+            <w:pPr>
+              <w:jc w:val="center"/>
+              <w:rPr>
+                <w:sz w:val="28"/>
+                <w:szCs w:val="28"/>
+              </w:rPr>
+            </w:pPr>
+            <w:r>
+              <w:rPr>
+                <w:sz w:val="28"/>
+                <w:szCs w:val="28"/>
+              </w:rPr>
+              <w:t>АТС. Точек подключения (незадействованное/ задействовано)</w:t>
+            </w:r>
+          </w:p>
+        </w:tc>
+        <w:tc>
+          <w:tcPr>
+            <w:tcW w:w="2941" w:type="dxa"/>
+          </w:tcPr>
+          <w:p>
+            <w:pPr>
+              <w:jc w:val="center"/>
+              <w:rPr>
+                <w:sz w:val="28"/>
+                <w:szCs w:val="28"/>
+              </w:rPr>
+            </w:pPr>
+            <w:r>
+              <w:rPr>
+                <w:sz w:val="28"/>
+                <w:szCs w:val="28"/>
+              </w:rPr>
+              <w:t>2400/2000</w:t>
+            </w:r>
+          </w:p>
+        </w:tc>
+        <w:tc>
+          <w:tcPr>
+            <w:tcW w:w="2370" w:type="dxa"/>
+            <w:shd w:val="clear" w:color="auto" w:fill="E7E6E6" w:themeFill="background2"/>
+          </w:tcPr>
+          <w:p>
+            <w:pPr>
+              <w:jc w:val="center"/>
+              <w:rPr>
+                <w:sz w:val="28"/>
+                <w:szCs w:val="28"/>
+              </w:rPr>
+            </w:pPr>
+            <w:r>
+              <w:rPr>
+                <w:sz w:val="28"/>
+                <w:szCs w:val="28"/>
+              </w:rPr>
+              <w:t>1400/1000</w:t>
+            </w:r>
+          </w:p>
+        </w:tc>
+      </w:tr>
+      <w:tr>
+        <w:tc>
+          <w:tcPr>
+            <w:tcW w:w="3705" w:type="dxa"/>
+          </w:tcPr>
+          <w:p>
+            <w:pPr>
+              <w:jc w:val="center"/>
+              <w:rPr>
+                <w:sz w:val="28"/>
+                <w:szCs w:val="28"/>
+              </w:rPr>
+            </w:pPr>
+            <w:r>
+              <w:rPr>
+                <w:sz w:val="28"/>
+                <w:szCs w:val="28"/>
+              </w:rPr>
+              <w:t>Лаз с цифровыми оконченными полукомплектами., канал</w:t>
+            </w:r>
+          </w:p>
+        </w:tc>
+        <w:tc>
+          <w:tcPr>
+            <w:tcW w:w="2941" w:type="dxa"/>
+          </w:tcPr>
+          <w:p>
+            <w:pPr>
+              <w:jc w:val="center"/>
+              <w:rPr>
+                <w:sz w:val="28"/>
+                <w:szCs w:val="28"/>
+              </w:rPr>
+            </w:pPr>
+            <w:r>
+              <w:rPr>
+                <w:sz w:val="28"/>
+                <w:szCs w:val="28"/>
+              </w:rPr>
+              <w:t>570</w:t>
+            </w:r>
+          </w:p>
+        </w:tc>
+        <w:tc>
+          <w:tcPr>
+            <w:tcW w:w="2370" w:type="dxa"/>
+            <w:shd w:val="clear" w:color="auto" w:fill="E7E6E6" w:themeFill="background2"/>
+          </w:tcPr>
+          <w:p>
+            <w:pPr>
+              <w:jc w:val="center"/>
+              <w:rPr>
+                <w:sz w:val="28"/>
+                <w:szCs w:val="28"/>
+              </w:rPr>
+            </w:pPr>
+            <w:r>
+              <w:rPr>
+                <w:sz w:val="28"/>
+                <w:szCs w:val="28"/>
+              </w:rPr>
+              <w:t>270</w:t>
+            </w:r>
+          </w:p>
+        </w:tc>
+      </w:tr>
+      <w:tr>
+        <w:tc>
+          <w:tcPr>
+            <w:tcW w:w="3705" w:type="dxa"/>
+          </w:tcPr>
+          <w:p>
+            <w:pPr>
+              <w:jc w:val="center"/>
+              <w:rPr>
+                <w:sz w:val="28"/>
+                <w:szCs w:val="28"/>
+              </w:rPr>
+            </w:pPr>
+            <w:r>
+              <w:rPr>
+                <w:sz w:val="28"/>
+                <w:szCs w:val="28"/>
+              </w:rPr>
+              <w:t xml:space="preserve">Автоматическая цифровая </w:t>
+            </w:r>
+            <w:proofErr w:type="gramStart"/>
+            <w:r>
+              <w:rPr>
+                <w:sz w:val="28"/>
+                <w:szCs w:val="28"/>
+              </w:rPr>
+              <w:t>ТС ,точек</w:t>
+            </w:r>
+            <w:proofErr w:type="gramEnd"/>
+            <w:r>
+              <w:rPr>
+                <w:sz w:val="28"/>
+                <w:szCs w:val="28"/>
+              </w:rPr>
+              <w:t xml:space="preserve"> подключения</w:t>
+            </w:r>
+          </w:p>
+        </w:tc>
+        <w:tc>
+          <w:tcPr>
+            <w:tcW w:w="2941" w:type="dxa"/>
+          </w:tcPr>
+          <w:p>
+            <w:pPr>
+              <w:jc w:val="center"/>
+              <w:rPr>
+                <w:sz w:val="28"/>
+                <w:szCs w:val="28"/>
+              </w:rPr>
+            </w:pPr>
+            <w:r>
+              <w:rPr>
+                <w:sz w:val="28"/>
+                <w:szCs w:val="28"/>
+              </w:rPr>
+              <w:t>7900</w:t>
+            </w:r>
+          </w:p>
+        </w:tc>
+        <w:tc>
+          <w:tcPr>
+            <w:tcW w:w="2370" w:type="dxa"/>
+            <w:shd w:val="clear" w:color="auto" w:fill="E7E6E6" w:themeFill="background2"/>
+          </w:tcPr>
+          <w:p>
+            <w:pPr>
+              <w:jc w:val="center"/>
+              <w:rPr>
+                <w:sz w:val="28"/>
+                <w:szCs w:val="28"/>
+              </w:rPr>
+            </w:pPr>
+            <w:r>
+              <w:rPr>
+                <w:sz w:val="28"/>
+                <w:szCs w:val="28"/>
+              </w:rPr>
+              <w:t>2900</w:t>
+            </w:r>
+          </w:p>
+        </w:tc>
+      </w:tr>
+      <w:tr>
+        <w:tc>
+          <w:tcPr>
+            <w:tcW w:w="3705" w:type="dxa"/>
+          </w:tcPr>
+          <w:p>
+            <w:pPr>
+              <w:jc w:val="center"/>
+              <w:rPr>
+                <w:sz w:val="28"/>
+                <w:szCs w:val="28"/>
+              </w:rPr>
+            </w:pPr>
+            <w:r>
+              <w:rPr>
+                <w:sz w:val="28"/>
+                <w:szCs w:val="28"/>
+              </w:rPr>
+              <w:t>Факсимильные телеграфные аппараты,</w:t>
+            </w:r>
+            <w:r>
+              <w:rPr>
+                <w:sz w:val="28"/>
+                <w:szCs w:val="28"/>
+              </w:rPr>
+              <w:t xml:space="preserve"> </w:t>
+            </w:r>
+            <w:r>
+              <w:rPr>
+                <w:sz w:val="28"/>
+                <w:szCs w:val="28"/>
+              </w:rPr>
+              <w:t>аппарат</w:t>
+            </w:r>
+          </w:p>
+        </w:tc>
+        <w:tc>
+          <w:tcPr>
+            <w:tcW w:w="2941" w:type="dxa"/>
+          </w:tcPr>
+          <w:p>
+            <w:pPr>
+              <w:jc w:val="center"/>
+              <w:rPr>
+                <w:sz w:val="28"/>
+                <w:szCs w:val="28"/>
+              </w:rPr>
+            </w:pPr>
+            <w:r>
+              <w:rPr>
+                <w:sz w:val="28"/>
+                <w:szCs w:val="28"/>
+              </w:rPr>
+              <w:t>43</w:t>
+            </w:r>
+          </w:p>
+        </w:tc>
+        <w:tc>
+          <w:tcPr>
+            <w:tcW w:w="2370" w:type="dxa"/>
+            <w:shd w:val="clear" w:color="auto" w:fill="E7E6E6" w:themeFill="background2"/>
+          </w:tcPr>
+          <w:p>
+            <w:pPr>
+              <w:jc w:val="center"/>
+              <w:rPr>
+                <w:sz w:val="28"/>
+                <w:szCs w:val="28"/>
+              </w:rPr>
+            </w:pPr>
+            <w:r>
+              <w:rPr>
+                <w:sz w:val="28"/>
+                <w:szCs w:val="28"/>
+              </w:rPr>
+              <w:t>19</w:t>
+            </w:r>
+          </w:p>
+        </w:tc>
+      </w:tr>
+      <w:tr>
+        <w:tc>
+          <w:tcPr>
+            <w:tcW w:w="3705" w:type="dxa"/>
+          </w:tcPr>
+          <w:p>
+            <w:pPr>
+              <w:jc w:val="center"/>
+              <w:rPr>
+                <w:sz w:val="28"/>
+                <w:szCs w:val="28"/>
+              </w:rPr>
+            </w:pPr>
+            <w:r>
+              <w:rPr>
+                <w:sz w:val="28"/>
+                <w:szCs w:val="28"/>
+              </w:rPr>
+              <w:t>Распорядительная станция связи комплект, диспетчерской по станционной</w:t>
+            </w:r>
+          </w:p>
+        </w:tc>
+        <w:tc>
+          <w:tcPr>
+            <w:tcW w:w="2941" w:type="dxa"/>
+          </w:tcPr>
+          <w:p>
+            <w:pPr>
+              <w:jc w:val="center"/>
+              <w:rPr>
+                <w:sz w:val="28"/>
+                <w:szCs w:val="28"/>
+              </w:rPr>
+            </w:pPr>
+            <w:r>
+              <w:rPr>
+                <w:sz w:val="28"/>
+                <w:szCs w:val="28"/>
+              </w:rPr>
+              <w:t>5/2</w:t>
+            </w:r>
+          </w:p>
+        </w:tc>
+        <w:tc>
+          <w:tcPr>
+            <w:tcW w:w="2370" w:type="dxa"/>
+            <w:shd w:val="clear" w:color="auto" w:fill="E7E6E6" w:themeFill="background2"/>
+          </w:tcPr>
+          <w:p>
+            <w:pPr>
+              <w:jc w:val="center"/>
+              <w:rPr>
+                <w:sz w:val="28"/>
+                <w:szCs w:val="28"/>
+              </w:rPr>
+            </w:pPr>
+            <w:r>
+              <w:rPr>
+                <w:sz w:val="28"/>
+                <w:szCs w:val="28"/>
+              </w:rPr>
+              <w:t>3/1</w:t>
+            </w:r>
+          </w:p>
+        </w:tc>
+      </w:tr>
+      <w:tr>
+        <w:tc>
+          <w:tcPr>
+            <w:tcW w:w="3705" w:type="dxa"/>
+          </w:tcPr>
+          <w:p>
+            <w:pPr>
+              <w:jc w:val="center"/>
+              <w:rPr>
+                <w:sz w:val="28"/>
+                <w:szCs w:val="28"/>
+              </w:rPr>
+            </w:pPr>
+            <w:r>
+              <w:rPr>
+                <w:sz w:val="28"/>
+                <w:szCs w:val="28"/>
+              </w:rPr>
+              <w:t>Коммутаторы оперативно технологической связи номер</w:t>
+            </w:r>
+          </w:p>
+        </w:tc>
+        <w:tc>
+          <w:tcPr>
+            <w:tcW w:w="2941" w:type="dxa"/>
+          </w:tcPr>
+          <w:p>
+            <w:pPr>
+              <w:jc w:val="center"/>
+              <w:rPr>
+                <w:sz w:val="28"/>
+                <w:szCs w:val="28"/>
+              </w:rPr>
+            </w:pPr>
+            <w:r>
+              <w:rPr>
+                <w:sz w:val="28"/>
+                <w:szCs w:val="28"/>
+              </w:rPr>
+              <w:t>800</w:t>
+            </w:r>
+          </w:p>
+        </w:tc>
+        <w:tc>
+          <w:tcPr>
+            <w:tcW w:w="2370" w:type="dxa"/>
+            <w:shd w:val="clear" w:color="auto" w:fill="E7E6E6" w:themeFill="background2"/>
+          </w:tcPr>
+          <w:p>
+            <w:pPr>
+              <w:jc w:val="center"/>
+              <w:rPr>
+                <w:sz w:val="28"/>
+                <w:szCs w:val="28"/>
+              </w:rPr>
+            </w:pPr>
+            <w:r>
+              <w:rPr>
+                <w:sz w:val="28"/>
+                <w:szCs w:val="28"/>
+              </w:rPr>
+              <w:t>900</w:t>
+            </w:r>
+          </w:p>
+        </w:tc>
+      </w:tr>
+      <w:tr>
+        <w:tc>
+          <w:tcPr>
+            <w:tcW w:w="3705" w:type="dxa"/>
+          </w:tcPr>
+          <w:p>
+            <w:pPr>
+              <w:jc w:val="center"/>
+              <w:rPr>
+                <w:sz w:val="28"/>
+                <w:szCs w:val="28"/>
+              </w:rPr>
+            </w:pPr>
+            <w:r>
+              <w:rPr>
+                <w:sz w:val="28"/>
+                <w:szCs w:val="28"/>
+              </w:rPr>
+              <w:t>Часы первичные электрические вторичные, шт</w:t>
+            </w:r>
+          </w:p>
+        </w:tc>
+        <w:tc>
+          <w:tcPr>
+            <w:tcW w:w="2941" w:type="dxa"/>
+          </w:tcPr>
+          <w:p>
+            <w:pPr>
+              <w:jc w:val="center"/>
+              <w:rPr>
+                <w:sz w:val="28"/>
+                <w:szCs w:val="28"/>
+              </w:rPr>
+            </w:pPr>
+            <w:r>
+              <w:rPr>
+                <w:sz w:val="28"/>
+                <w:szCs w:val="28"/>
+              </w:rPr>
+              <w:t>25/125</w:t>
+            </w:r>
+          </w:p>
+        </w:tc>
+        <w:tc>
+          <w:tcPr>
+            <w:tcW w:w="2370" w:type="dxa"/>
+            <w:shd w:val="clear" w:color="auto" w:fill="E7E6E6" w:themeFill="background2"/>
+          </w:tcPr>
+          <w:p>
+            <w:pPr>
+              <w:jc w:val="center"/>
+              <w:rPr>
+                <w:sz w:val="28"/>
+                <w:szCs w:val="28"/>
+              </w:rPr>
+            </w:pPr>
+            <w:r>
+              <w:rPr>
+                <w:sz w:val="28"/>
+                <w:szCs w:val="28"/>
+              </w:rPr>
+              <w:t>13/60</w:t>
+            </w:r>
+          </w:p>
+        </w:tc>
+      </w:tr>
+    </w:tbl>
     <w:p>
       <w:pPr>
         <w:jc w:val="center"/>
@@ -329,6 +1042,12 @@
           <w:color w:val="000000"/>
         </w:rPr>
       </w:pPr>
+      <w:r>
+        <w:rPr>
+          <w:color w:val="000000"/>
+        </w:rPr>
+        <w:t xml:space="preserve"> </w:t>
+      </w:r>
       <w:r>
         <w:rPr>
           <w:color w:val="000000"/>
@@ -344,10 +1063,19 @@
         </w:rPr>
       </w:pPr>
     </w:p>
+    <w:p>
+      <w:pPr>
+        <w:ind w:left="1134" w:hanging="1134"/>
+        <w:rPr>
+          <w:sz w:val="28"/>
+          <w:szCs w:val="28"/>
+        </w:rPr>
+      </w:pPr>
+    </w:p>
     <w:tbl>
       <w:tblPr>
-        <w:tblStyle w:val="ac"/>
-        <w:tblpPr w:leftFromText="180" w:rightFromText="180" w:vertAnchor="page" w:horzAnchor="margin" w:tblpY="9041"/>
+        <w:tblStyle w:val="TableGrid"/>
+        <w:tblpPr w:leftFromText="180" w:rightFromText="180" w:vertAnchor="page" w:horzAnchor="margin" w:tblpY="2005"/>
         <w:tblW w:w="0" w:type="auto"/>
         <w:tblLook w:val="04A0" w:firstRow="1" w:lastRow="0" w:firstColumn="1" w:lastColumn="0" w:noHBand="0" w:noVBand="1"/>
       </w:tblPr>
@@ -358,150 +1086,6 @@
       <w:tr>
         <w:tc>
           <w:tcPr>
-            <w:tcW w:w="4673" w:type="dxa"/>
-            <w:vMerge w:val="restart"/>
-          </w:tcPr>
-          <w:p>
-            <w:pPr>
-              <w:jc w:val="center"/>
-              <w:rPr>
-                <w:sz w:val="28"/>
-                <w:szCs w:val="28"/>
-              </w:rPr>
-            </w:pPr>
-            <w:r>
-              <w:rPr>
-                <w:sz w:val="28"/>
-                <w:szCs w:val="28"/>
-              </w:rPr>
-              <w:t>Обслуживание устройства цифровая</w:t>
-            </w:r>
-          </w:p>
-        </w:tc>
-        <w:tc>
-          <w:tcPr>
-            <w:tcW w:w="4343" w:type="dxa"/>
-          </w:tcPr>
-          <w:p>
-            <w:pPr>
-              <w:jc w:val="center"/>
-              <w:rPr>
-                <w:sz w:val="28"/>
-                <w:szCs w:val="28"/>
-              </w:rPr>
-            </w:pPr>
-            <w:r>
-              <w:rPr>
-                <w:sz w:val="28"/>
-                <w:szCs w:val="28"/>
-              </w:rPr>
-              <w:t>Цифра &lt;&lt;</w:t>
-            </w:r>
-            <w:r>
-              <w:rPr>
-                <w:sz w:val="28"/>
-                <w:szCs w:val="28"/>
-                <w:lang w:val="en-US"/>
-              </w:rPr>
-              <w:t>y</w:t>
-            </w:r>
-            <w:r>
-              <w:rPr>
-                <w:sz w:val="28"/>
-                <w:szCs w:val="28"/>
-              </w:rPr>
-              <w:t>&gt;&gt; в номере варианта</w:t>
-            </w:r>
-          </w:p>
-        </w:tc>
-      </w:tr>
-      <w:tr>
-        <w:tc>
-          <w:tcPr>
-            <w:tcW w:w="4673" w:type="dxa"/>
-            <w:vMerge/>
-          </w:tcPr>
-          <w:p>
-            <w:pPr>
-              <w:jc w:val="center"/>
-              <w:rPr>
-                <w:sz w:val="28"/>
-                <w:szCs w:val="28"/>
-              </w:rPr>
-            </w:pPr>
-          </w:p>
-        </w:tc>
-        <w:tc>
-          <w:tcPr>
-            <w:tcW w:w="4343" w:type="dxa"/>
-          </w:tcPr>
-          <w:p>
-            <w:pPr>
-              <w:jc w:val="center"/>
-              <w:rPr>
-                <w:sz w:val="28"/>
-                <w:szCs w:val="28"/>
-              </w:rPr>
-            </w:pPr>
-            <w:r>
-              <w:rPr>
-                <w:sz w:val="28"/>
-                <w:szCs w:val="28"/>
-              </w:rPr>
-              <w:t>7</w:t>
-            </w:r>
-          </w:p>
-        </w:tc>
-      </w:tr>
-      <w:tr>
-        <w:tc>
-          <w:tcPr>
-            <w:tcW w:w="4673" w:type="dxa"/>
-          </w:tcPr>
-          <w:p>
-            <w:pPr>
-              <w:jc w:val="center"/>
-              <w:rPr>
-                <w:sz w:val="28"/>
-                <w:szCs w:val="28"/>
-                <w:lang w:val="en-US"/>
-              </w:rPr>
-            </w:pPr>
-            <w:r>
-              <w:rPr>
-                <w:sz w:val="28"/>
-                <w:szCs w:val="28"/>
-                <w:lang w:val="en-US"/>
-              </w:rPr>
-              <w:t>1</w:t>
-            </w:r>
-          </w:p>
-        </w:tc>
-        <w:tc>
-          <w:tcPr>
-            <w:tcW w:w="4343" w:type="dxa"/>
-          </w:tcPr>
-          <w:p>
-            <w:pPr>
-              <w:jc w:val="center"/>
-              <w:rPr>
-                <w:sz w:val="28"/>
-                <w:szCs w:val="28"/>
-              </w:rPr>
-            </w:pPr>
-            <w:r>
-              <w:rPr>
-                <w:sz w:val="28"/>
-                <w:szCs w:val="28"/>
-              </w:rPr>
-              <w:t>8</w:t>
-            </w:r>
-          </w:p>
-        </w:tc>
-      </w:tr>
-      <w:tr>
-        <w:tc>
-          <w:tcPr>
             <w:tcW w:w="9016" w:type="dxa"/>
             <w:gridSpan w:val="2"/>
           </w:tcPr>
@@ -518,7 +1102,7 @@
                 <w:sz w:val="28"/>
                 <w:szCs w:val="28"/>
               </w:rPr>
-              <w:t>Устройства проводной связи</w:t>
+              <w:t>Устройства радиосвязи</w:t>
             </w:r>
           </w:p>
         </w:tc>
@@ -541,7 +1125,7 @@
                 <w:sz w:val="28"/>
                 <w:szCs w:val="28"/>
               </w:rPr>
-              <w:t>АТС. Точек подключения (незадействованное/ задействовано)</w:t>
+              <w:t>Локомотивные радиостанции проездной связи р/ст &lt;&lt;чужих/своих&gt;&gt;</w:t>
             </w:r>
           </w:p>
         </w:tc>
@@ -562,7 +1146,21 @@
                 <w:sz w:val="28"/>
                 <w:szCs w:val="28"/>
               </w:rPr>
-              <w:t>2400/2000</w:t>
+              <w:t>0/</w:t>
+            </w:r>
+            <w:r>
+              <w:rPr>
+                <w:sz w:val="28"/>
+                <w:szCs w:val="28"/>
+              </w:rPr>
+              <w:t>2</w:t>
+            </w:r>
+            <w:r>
+              <w:rPr>
+                <w:sz w:val="28"/>
+                <w:szCs w:val="28"/>
+              </w:rPr>
+              <w:t>50</w:t>
             </w:r>
           </w:p>
         </w:tc>
@@ -585,7 +1183,7 @@
                 <w:sz w:val="28"/>
                 <w:szCs w:val="28"/>
               </w:rPr>
-              <w:t>Лаз с цифровыми оконченными полукомплектами., канал</w:t>
+              <w:t>Станционных радиостанций проездной радиосвязи р/ст</w:t>
             </w:r>
           </w:p>
         </w:tc>
@@ -606,7 +1204,7 @@
                 <w:sz w:val="28"/>
                 <w:szCs w:val="28"/>
               </w:rPr>
-              <w:t>570</w:t>
+              <w:t>45</w:t>
             </w:r>
           </w:p>
         </w:tc>
@@ -629,23 +1227,7 @@
                 <w:sz w:val="28"/>
                 <w:szCs w:val="28"/>
               </w:rPr>
-              <w:t xml:space="preserve">Автоматическая цифровая </w:t>
-            </w:r>
-            <w:proofErr w:type="gramStart"/>
-            <w:r>
-              <w:rPr>
-                <w:sz w:val="28"/>
-                <w:szCs w:val="28"/>
-              </w:rPr>
-              <w:t>ТС ,точек</w:t>
-            </w:r>
-            <w:proofErr w:type="gramEnd"/>
-            <w:r>
-              <w:rPr>
-                <w:sz w:val="28"/>
-                <w:szCs w:val="28"/>
-              </w:rPr>
-              <w:t xml:space="preserve"> подключения</w:t>
+              <w:t>Радиостанция локомотивные станционной радиосвязи</w:t>
             </w:r>
           </w:p>
         </w:tc>
@@ -666,7 +1248,7 @@
                 <w:sz w:val="28"/>
                 <w:szCs w:val="28"/>
               </w:rPr>
-              <w:t>7900</w:t>
+              <w:t>13</w:t>
             </w:r>
           </w:p>
         </w:tc>
@@ -689,17 +1271,8 @@
                 <w:sz w:val="28"/>
                 <w:szCs w:val="28"/>
               </w:rPr>
-              <w:t>Факсимильные телеграфные аппараты</w:t>
-            </w:r>
-            <w:proofErr w:type="gramStart"/>
-            <w:r>
-              <w:rPr>
-                <w:sz w:val="28"/>
-                <w:szCs w:val="28"/>
-              </w:rPr>
-              <w:t>, ,аппарат</w:t>
-            </w:r>
-            <w:proofErr w:type="gramEnd"/>
+              <w:t>Радиостанция стационарной станционный и ремонтные оперативной радиосвязи и возимые р/ст</w:t>
+            </w:r>
           </w:p>
         </w:tc>
         <w:tc>
@@ -719,7 +1292,7 @@
                 <w:sz w:val="28"/>
                 <w:szCs w:val="28"/>
               </w:rPr>
-              <w:t>43</w:t>
+              <w:t>46</w:t>
             </w:r>
           </w:p>
         </w:tc>
@@ -742,7 +1315,7 @@
                 <w:sz w:val="28"/>
                 <w:szCs w:val="28"/>
               </w:rPr>
-              <w:t>Распорядительная станция связи комплект, диспетчерской по станционной</w:t>
+              <w:t>Радиостанция информаторы комплект</w:t>
             </w:r>
           </w:p>
         </w:tc>
@@ -763,104 +1336,7 @@
                 <w:sz w:val="28"/>
                 <w:szCs w:val="28"/>
               </w:rPr>
-              <w:t>5/2</w:t>
-            </w:r>
-          </w:p>
-        </w:tc>
-      </w:tr>
-      <w:tr>
-        <w:tc>
-          <w:tcPr>
-            <w:tcW w:w="4673" w:type="dxa"/>
-          </w:tcPr>
-          <w:p>
-            <w:pPr>
-              <w:jc w:val="center"/>
-              <w:rPr>
-                <w:sz w:val="28"/>
-                <w:szCs w:val="28"/>
-              </w:rPr>
-            </w:pPr>
-            <w:r>
-              <w:rPr>
-                <w:sz w:val="28"/>
-                <w:szCs w:val="28"/>
-              </w:rPr>
-              <w:t>Коммутаторы оперативно технологической связи номер</w:t>
-            </w:r>
-          </w:p>
-        </w:tc>
-        <w:tc>
-          <w:tcPr>
-            <w:tcW w:w="4343" w:type="dxa"/>
-          </w:tcPr>
-          <w:p>
-            <w:pPr>
-              <w:jc w:val="center"/>
-              <w:rPr>
-                <w:sz w:val="28"/>
-                <w:szCs w:val="28"/>
-              </w:rPr>
-            </w:pPr>
-            <w:r>
-              <w:rPr>
-                <w:sz w:val="28"/>
-                <w:szCs w:val="28"/>
-              </w:rPr>
-              <w:t>800</w:t>
-            </w:r>
-          </w:p>
-        </w:tc>
-      </w:tr>
-      <w:tr>
-        <w:tc>
-          <w:tcPr>
-            <w:tcW w:w="4673" w:type="dxa"/>
-          </w:tcPr>
-          <w:p>
-            <w:pPr>
-              <w:jc w:val="center"/>
-              <w:rPr>
-                <w:sz w:val="28"/>
-                <w:szCs w:val="28"/>
-              </w:rPr>
-            </w:pPr>
-            <w:r>
-              <w:rPr>
-                <w:sz w:val="28"/>
-                <w:szCs w:val="28"/>
-              </w:rPr>
-              <w:t xml:space="preserve">Часы первичные электрические вторичные, </w:t>
-            </w:r>
-            <w:proofErr w:type="spellStart"/>
-            <w:r>
-              <w:rPr>
-                <w:sz w:val="28"/>
-                <w:szCs w:val="28"/>
-              </w:rPr>
-              <w:t>шт</w:t>
-            </w:r>
-            <w:proofErr w:type="spellEnd"/>
-          </w:p>
-        </w:tc>
-        <w:tc>
-          <w:tcPr>
-            <w:tcW w:w="4343" w:type="dxa"/>
-          </w:tcPr>
-          <w:p>
-            <w:pPr>
-              <w:jc w:val="center"/>
-              <w:rPr>
-                <w:sz w:val="28"/>
-                <w:szCs w:val="28"/>
-              </w:rPr>
-            </w:pPr>
-            <w:r>
-              <w:rPr>
-                <w:sz w:val="28"/>
-                <w:szCs w:val="28"/>
-              </w:rPr>
-              <w:t>25/125</w:t>
+              <w:t>26</w:t>
             </w:r>
           </w:p>
         </w:tc>
@@ -868,9 +1344,11 @@
     </w:tbl>
     <w:p>
       <w:pPr>
+        <w:ind w:left="1134" w:hanging="1134"/>
         <w:rPr>
           <w:sz w:val="28"/>
           <w:szCs w:val="28"/>
+          <w:lang w:val="en-US"/>
         </w:rPr>
       </w:pPr>
     </w:p>
@@ -880,317 +1358,6 @@
         <w:rPr>
           <w:sz w:val="28"/>
           <w:szCs w:val="28"/>
-        </w:rPr>
-      </w:pPr>
-    </w:p>
-    <w:tbl>
-      <w:tblPr>
-        <w:tblStyle w:val="ac"/>
-        <w:tblpPr w:leftFromText="180" w:rightFromText="180" w:vertAnchor="page" w:horzAnchor="margin" w:tblpY="612"/>
-        <w:tblW w:w="0" w:type="auto"/>
-        <w:tblLook w:val="04A0" w:firstRow="1" w:lastRow="0" w:firstColumn="1" w:lastColumn="0" w:noHBand="0" w:noVBand="1"/>
-      </w:tblPr>
-      <w:tblGrid>
-        <w:gridCol w:w="4673"/>
-        <w:gridCol w:w="4343"/>
-      </w:tblGrid>
-      <w:tr>
-        <w:tc>
-          <w:tcPr>
-            <w:tcW w:w="9016" w:type="dxa"/>
-            <w:gridSpan w:val="2"/>
-          </w:tcPr>
-          <w:p>
-            <w:pPr>
-              <w:jc w:val="center"/>
-              <w:rPr>
-                <w:sz w:val="28"/>
-                <w:szCs w:val="28"/>
-              </w:rPr>
-            </w:pPr>
-            <w:r>
-              <w:rPr>
-                <w:sz w:val="28"/>
-                <w:szCs w:val="28"/>
-              </w:rPr>
-              <w:lastRenderedPageBreak/>
-              <w:t>Устройства радиосвязи</w:t>
-            </w:r>
-          </w:p>
-        </w:tc>
-      </w:tr>
-      <w:tr>
-        <w:tc>
-          <w:tcPr>
-            <w:tcW w:w="4673" w:type="dxa"/>
-          </w:tcPr>
-          <w:p>
-            <w:pPr>
-              <w:jc w:val="center"/>
-              <w:rPr>
-                <w:sz w:val="28"/>
-                <w:szCs w:val="28"/>
-              </w:rPr>
-            </w:pPr>
-            <w:r>
-              <w:rPr>
-                <w:sz w:val="28"/>
-                <w:szCs w:val="28"/>
-              </w:rPr>
-              <w:t>Локомотивные радиостанции проездной связи р/</w:t>
-            </w:r>
-            <w:proofErr w:type="spellStart"/>
-            <w:r>
-              <w:rPr>
-                <w:sz w:val="28"/>
-                <w:szCs w:val="28"/>
-              </w:rPr>
-              <w:t>ст</w:t>
-            </w:r>
-            <w:proofErr w:type="spellEnd"/>
-            <w:r>
-              <w:rPr>
-                <w:sz w:val="28"/>
-                <w:szCs w:val="28"/>
-              </w:rPr>
-              <w:t xml:space="preserve"> &lt;&lt;чужих/своих&gt;&gt;</w:t>
-            </w:r>
-          </w:p>
-        </w:tc>
-        <w:tc>
-          <w:tcPr>
-            <w:tcW w:w="4343" w:type="dxa"/>
-          </w:tcPr>
-          <w:p>
-            <w:pPr>
-              <w:jc w:val="center"/>
-              <w:rPr>
-                <w:sz w:val="28"/>
-                <w:szCs w:val="28"/>
-              </w:rPr>
-            </w:pPr>
-            <w:r>
-              <w:rPr>
-                <w:sz w:val="28"/>
-                <w:szCs w:val="28"/>
-              </w:rPr>
-              <w:t>0/550</w:t>
-            </w:r>
-          </w:p>
-        </w:tc>
-      </w:tr>
-      <w:tr>
-        <w:tc>
-          <w:tcPr>
-            <w:tcW w:w="4673" w:type="dxa"/>
-          </w:tcPr>
-          <w:p>
-            <w:pPr>
-              <w:jc w:val="center"/>
-              <w:rPr>
-                <w:sz w:val="28"/>
-                <w:szCs w:val="28"/>
-              </w:rPr>
-            </w:pPr>
-            <w:r>
-              <w:rPr>
-                <w:sz w:val="28"/>
-                <w:szCs w:val="28"/>
-              </w:rPr>
-              <w:t>Станционных радиостанций проездной радиосвязи р/</w:t>
-            </w:r>
-            <w:proofErr w:type="spellStart"/>
-            <w:r>
-              <w:rPr>
-                <w:sz w:val="28"/>
-                <w:szCs w:val="28"/>
-              </w:rPr>
-              <w:t>ст</w:t>
-            </w:r>
-            <w:proofErr w:type="spellEnd"/>
-          </w:p>
-        </w:tc>
-        <w:tc>
-          <w:tcPr>
-            <w:tcW w:w="4343" w:type="dxa"/>
-          </w:tcPr>
-          <w:p>
-            <w:pPr>
-              <w:jc w:val="center"/>
-              <w:rPr>
-                <w:sz w:val="28"/>
-                <w:szCs w:val="28"/>
-              </w:rPr>
-            </w:pPr>
-            <w:r>
-              <w:rPr>
-                <w:sz w:val="28"/>
-                <w:szCs w:val="28"/>
-              </w:rPr>
-              <w:t>89</w:t>
-            </w:r>
-          </w:p>
-        </w:tc>
-      </w:tr>
-      <w:tr>
-        <w:tc>
-          <w:tcPr>
-            <w:tcW w:w="4673" w:type="dxa"/>
-          </w:tcPr>
-          <w:p>
-            <w:pPr>
-              <w:jc w:val="center"/>
-              <w:rPr>
-                <w:sz w:val="28"/>
-                <w:szCs w:val="28"/>
-              </w:rPr>
-            </w:pPr>
-            <w:r>
-              <w:rPr>
-                <w:sz w:val="28"/>
-                <w:szCs w:val="28"/>
-              </w:rPr>
-              <w:t>Радиостанция локомотивные станционной радиосвязи</w:t>
-            </w:r>
-          </w:p>
-        </w:tc>
-        <w:tc>
-          <w:tcPr>
-            <w:tcW w:w="4343" w:type="dxa"/>
-          </w:tcPr>
-          <w:p>
-            <w:pPr>
-              <w:jc w:val="center"/>
-              <w:rPr>
-                <w:sz w:val="28"/>
-                <w:szCs w:val="28"/>
-              </w:rPr>
-            </w:pPr>
-            <w:r>
-              <w:rPr>
-                <w:sz w:val="28"/>
-                <w:szCs w:val="28"/>
-              </w:rPr>
-              <w:t>29</w:t>
-            </w:r>
-          </w:p>
-        </w:tc>
-      </w:tr>
-      <w:tr>
-        <w:tc>
-          <w:tcPr>
-            <w:tcW w:w="4673" w:type="dxa"/>
-          </w:tcPr>
-          <w:p>
-            <w:pPr>
-              <w:jc w:val="center"/>
-              <w:rPr>
-                <w:sz w:val="28"/>
-                <w:szCs w:val="28"/>
-              </w:rPr>
-            </w:pPr>
-            <w:r>
-              <w:rPr>
-                <w:sz w:val="28"/>
-                <w:szCs w:val="28"/>
-              </w:rPr>
-              <w:t>Радиостанция стационарной станционный и ремонтные оперативной радиосвязи и возимые р/</w:t>
-            </w:r>
-            <w:proofErr w:type="spellStart"/>
-            <w:r>
-              <w:rPr>
-                <w:sz w:val="28"/>
-                <w:szCs w:val="28"/>
-              </w:rPr>
-              <w:t>ст</w:t>
-            </w:r>
-            <w:proofErr w:type="spellEnd"/>
-          </w:p>
-        </w:tc>
-        <w:tc>
-          <w:tcPr>
-            <w:tcW w:w="4343" w:type="dxa"/>
-          </w:tcPr>
-          <w:p>
-            <w:pPr>
-              <w:jc w:val="center"/>
-              <w:rPr>
-                <w:sz w:val="28"/>
-                <w:szCs w:val="28"/>
-              </w:rPr>
-            </w:pPr>
-            <w:r>
-              <w:rPr>
-                <w:sz w:val="28"/>
-                <w:szCs w:val="28"/>
-              </w:rPr>
-              <w:t>85</w:t>
-            </w:r>
-          </w:p>
-        </w:tc>
-      </w:tr>
-      <w:tr>
-        <w:tc>
-          <w:tcPr>
-            <w:tcW w:w="4673" w:type="dxa"/>
-          </w:tcPr>
-          <w:p>
-            <w:pPr>
-              <w:jc w:val="center"/>
-              <w:rPr>
-                <w:sz w:val="28"/>
-                <w:szCs w:val="28"/>
-              </w:rPr>
-            </w:pPr>
-            <w:r>
-              <w:rPr>
-                <w:sz w:val="28"/>
-                <w:szCs w:val="28"/>
-              </w:rPr>
-              <w:t>Радиостанция информаторы комплект</w:t>
-            </w:r>
-          </w:p>
-        </w:tc>
-        <w:tc>
-          <w:tcPr>
-            <w:tcW w:w="4343" w:type="dxa"/>
-          </w:tcPr>
-          <w:p>
-            <w:pPr>
-              <w:jc w:val="center"/>
-              <w:rPr>
-                <w:sz w:val="28"/>
-                <w:szCs w:val="28"/>
-              </w:rPr>
-            </w:pPr>
-            <w:r>
-              <w:rPr>
-                <w:sz w:val="28"/>
-                <w:szCs w:val="28"/>
-              </w:rPr>
-              <w:t>53</w:t>
-            </w:r>
-          </w:p>
-        </w:tc>
-      </w:tr>
-    </w:tbl>
-    <w:p>
-      <w:pPr>
-        <w:ind w:left="1134" w:hanging="1134"/>
-        <w:rPr>
-          <w:sz w:val="28"/>
-          <w:szCs w:val="28"/>
-          <w:lang w:val="en-US"/>
-        </w:rPr>
-      </w:pPr>
-    </w:p>
-    <w:p>
-      <w:pPr>
-        <w:ind w:left="1134" w:hanging="1134"/>
-        <w:rPr>
-          <w:sz w:val="28"/>
-          <w:szCs w:val="28"/>
-          <w:lang w:val="en-US"/>
         </w:rPr>
       </w:pPr>
       <w:r>
@@ -1221,13 +1388,12 @@
         <w:rPr>
           <w:sz w:val="28"/>
           <w:szCs w:val="28"/>
-          <w:lang w:val="en-US"/>
         </w:rPr>
       </w:pPr>
     </w:p>
     <w:tbl>
       <w:tblPr>
-        <w:tblStyle w:val="ac"/>
+        <w:tblStyle w:val="TableGrid"/>
         <w:tblpPr w:leftFromText="180" w:rightFromText="180" w:vertAnchor="page" w:horzAnchor="margin" w:tblpY="6614"/>
         <w:tblW w:w="0" w:type="auto"/>
         <w:tblLook w:val="04A0" w:firstRow="1" w:lastRow="0" w:firstColumn="1" w:lastColumn="0" w:noHBand="0" w:noVBand="1"/>
@@ -1570,17 +1736,8 @@
                 <w:sz w:val="28"/>
                 <w:szCs w:val="28"/>
               </w:rPr>
-              <w:t>Факсимильные телеграфные аппараты</w:t>
-            </w:r>
-            <w:proofErr w:type="gramStart"/>
-            <w:r>
-              <w:rPr>
-                <w:sz w:val="28"/>
-                <w:szCs w:val="28"/>
-              </w:rPr>
-              <w:t>, ,аппарат</w:t>
-            </w:r>
-            <w:proofErr w:type="gramEnd"/>
+              <w:t>Факсимильные телеграфные аппараты, аппарат</w:t>
+            </w:r>
           </w:p>
         </w:tc>
         <w:tc>
@@ -1711,17 +1868,8 @@
                 <w:sz w:val="28"/>
                 <w:szCs w:val="28"/>
               </w:rPr>
-              <w:t xml:space="preserve">Часы первичные электрические вторичные, </w:t>
-            </w:r>
-            <w:proofErr w:type="spellStart"/>
-            <w:r>
-              <w:rPr>
-                <w:sz w:val="28"/>
-                <w:szCs w:val="28"/>
-              </w:rPr>
-              <w:t>шт</w:t>
-            </w:r>
-            <w:proofErr w:type="spellEnd"/>
+              <w:t>Часы первичные электрические вторичные, шт</w:t>
+            </w:r>
           </w:p>
         </w:tc>
         <w:tc>
@@ -1839,7 +1987,7 @@
     </w:p>
     <w:tbl>
       <w:tblPr>
-        <w:tblStyle w:val="ac"/>
+        <w:tblStyle w:val="TableGrid"/>
         <w:tblpPr w:leftFromText="180" w:rightFromText="180" w:vertAnchor="page" w:horzAnchor="margin" w:tblpY="1659"/>
         <w:tblW w:w="0" w:type="auto"/>
         <w:tblLook w:val="04A0" w:firstRow="1" w:lastRow="0" w:firstColumn="1" w:lastColumn="0" w:noHBand="0" w:noVBand="1"/>
@@ -1893,22 +2041,13 @@
               </w:rPr>
               <w:t xml:space="preserve">Информационная система отправления поездов </w:t>
             </w:r>
-            <w:proofErr w:type="spellStart"/>
             <w:proofErr w:type="gramStart"/>
             <w:r>
               <w:rPr>
                 <w:sz w:val="28"/>
                 <w:szCs w:val="28"/>
               </w:rPr>
-              <w:t>знако</w:t>
-            </w:r>
-            <w:proofErr w:type="spellEnd"/>
-            <w:r>
-              <w:rPr>
-                <w:sz w:val="28"/>
-                <w:szCs w:val="28"/>
-              </w:rPr>
-              <w:t>-мест</w:t>
+              <w:t>знако-мест</w:t>
             </w:r>
             <w:proofErr w:type="gramEnd"/>
           </w:p>
@@ -1930,7 +2069,7 @@
                 <w:sz w:val="28"/>
                 <w:szCs w:val="28"/>
               </w:rPr>
-              <w:t>74</w:t>
+              <w:t>37</w:t>
             </w:r>
           </w:p>
         </w:tc>
@@ -1974,7 +2113,7 @@
                 <w:sz w:val="28"/>
                 <w:szCs w:val="28"/>
               </w:rPr>
-              <w:t>35</w:t>
+              <w:t>17</w:t>
             </w:r>
           </w:p>
         </w:tc>
@@ -1997,17 +2136,8 @@
                 <w:sz w:val="28"/>
                 <w:szCs w:val="28"/>
               </w:rPr>
-              <w:t xml:space="preserve">Переговорное устройство типа &lt;&lt;пассажир-кассир&gt;&gt; </w:t>
-            </w:r>
-            <w:proofErr w:type="spellStart"/>
-            <w:r>
-              <w:rPr>
-                <w:sz w:val="28"/>
-                <w:szCs w:val="28"/>
-              </w:rPr>
-              <w:t>шт</w:t>
-            </w:r>
-            <w:proofErr w:type="spellEnd"/>
+              <w:t>Переговорное устройство типа &lt;&lt;пассажир-кассир&gt;&gt; шт</w:t>
+            </w:r>
           </w:p>
         </w:tc>
         <w:tc>
@@ -2027,7 +2157,7 @@
                 <w:sz w:val="28"/>
                 <w:szCs w:val="28"/>
               </w:rPr>
-              <w:t>86</w:t>
+              <w:t>43</w:t>
             </w:r>
           </w:p>
         </w:tc>
@@ -2074,17 +2204,8 @@
                 <w:sz w:val="28"/>
                 <w:szCs w:val="28"/>
               </w:rPr>
-              <w:t xml:space="preserve">Персональный ЭВМ </w:t>
-            </w:r>
-            <w:proofErr w:type="spellStart"/>
-            <w:r>
-              <w:rPr>
-                <w:sz w:val="28"/>
-                <w:szCs w:val="28"/>
-              </w:rPr>
-              <w:t>шт</w:t>
-            </w:r>
-            <w:proofErr w:type="spellEnd"/>
+              <w:t>Персональный ЭВМ шт</w:t>
+            </w:r>
           </w:p>
         </w:tc>
         <w:tc>
@@ -2104,15 +2225,52 @@
                 <w:sz w:val="28"/>
                 <w:szCs w:val="28"/>
               </w:rPr>
+              <w:t>16</w:t>
+            </w:r>
+          </w:p>
+        </w:tc>
+      </w:tr>
+      <w:tr>
+        <w:tc>
+          <w:tcPr>
+            <w:tcW w:w="4673" w:type="dxa"/>
+          </w:tcPr>
+          <w:p>
+            <w:pPr>
+              <w:jc w:val="center"/>
+              <w:rPr>
+                <w:sz w:val="28"/>
+                <w:szCs w:val="28"/>
+              </w:rPr>
+            </w:pPr>
+            <w:r>
+              <w:rPr>
+                <w:sz w:val="28"/>
+                <w:szCs w:val="28"/>
+              </w:rPr>
+              <w:t>Модем канал</w:t>
+            </w:r>
+          </w:p>
+        </w:tc>
+        <w:tc>
+          <w:tcPr>
+            <w:tcW w:w="4343" w:type="dxa"/>
+          </w:tcPr>
+          <w:p>
+            <w:pPr>
+              <w:jc w:val="center"/>
+              <w:rPr>
+                <w:sz w:val="28"/>
+                <w:szCs w:val="28"/>
+              </w:rPr>
+            </w:pPr>
+            <w:r>
+              <w:rPr>
+                <w:sz w:val="28"/>
+                <w:szCs w:val="28"/>
+              </w:rPr>
               <w:t>3</w:t>
             </w:r>
-            <w:r>
-              <w:rPr>
-                <w:sz w:val="28"/>
-                <w:szCs w:val="28"/>
-              </w:rPr>
-              <w:t>3</w:t>
-            </w:r>
           </w:p>
         </w:tc>
       </w:tr>
@@ -2134,7 +2292,7 @@
                 <w:sz w:val="28"/>
                 <w:szCs w:val="28"/>
               </w:rPr>
-              <w:t>Модем канал</w:t>
+              <w:t>Печатающее устройство шт</w:t>
             </w:r>
           </w:p>
         </w:tc>
@@ -2155,7 +2313,14 @@
                 <w:sz w:val="28"/>
                 <w:szCs w:val="28"/>
               </w:rPr>
-              <w:t>5</w:t>
+              <w:t>1</w:t>
+            </w:r>
+            <w:r>
+              <w:rPr>
+                <w:sz w:val="28"/>
+                <w:szCs w:val="28"/>
+              </w:rPr>
+              <w:t>1</w:t>
             </w:r>
           </w:p>
         </w:tc>
@@ -2178,17 +2343,8 @@
                 <w:sz w:val="28"/>
                 <w:szCs w:val="28"/>
               </w:rPr>
-              <w:t xml:space="preserve">Печатающее устройство </w:t>
-            </w:r>
-            <w:proofErr w:type="spellStart"/>
-            <w:r>
-              <w:rPr>
-                <w:sz w:val="28"/>
-                <w:szCs w:val="28"/>
-              </w:rPr>
-              <w:t>шт</w:t>
-            </w:r>
-            <w:proofErr w:type="spellEnd"/>
+              <w:t>Дисплей разного назначения шт</w:t>
+            </w:r>
           </w:p>
         </w:tc>
         <w:tc>
@@ -2201,21 +2357,15 @@
               <w:rPr>
                 <w:sz w:val="28"/>
                 <w:szCs w:val="28"/>
-              </w:rPr>
-            </w:pPr>
-            <w:r>
-              <w:rPr>
-                <w:sz w:val="28"/>
-                <w:szCs w:val="28"/>
-              </w:rPr>
-              <w:t>2</w:t>
-            </w:r>
-            <w:r>
-              <w:rPr>
-                <w:sz w:val="28"/>
-                <w:szCs w:val="28"/>
-              </w:rPr>
-              <w:t>1</w:t>
+                <w:lang w:val="en-US"/>
+              </w:rPr>
+            </w:pPr>
+            <w:r>
+              <w:rPr>
+                <w:sz w:val="28"/>
+                <w:szCs w:val="28"/>
+              </w:rPr>
+              <w:t>-</w:t>
             </w:r>
           </w:p>
         </w:tc>
@@ -2238,17 +2388,8 @@
                 <w:sz w:val="28"/>
                 <w:szCs w:val="28"/>
               </w:rPr>
-              <w:t xml:space="preserve">Дисплей разного назначения </w:t>
-            </w:r>
-            <w:proofErr w:type="spellStart"/>
-            <w:r>
-              <w:rPr>
-                <w:sz w:val="28"/>
-                <w:szCs w:val="28"/>
-              </w:rPr>
-              <w:t>шт</w:t>
-            </w:r>
-            <w:proofErr w:type="spellEnd"/>
+              <w:t>Аппаратура передачи данных комплект</w:t>
+            </w:r>
           </w:p>
         </w:tc>
         <w:tc>
@@ -2261,68 +2402,14 @@
               <w:rPr>
                 <w:sz w:val="28"/>
                 <w:szCs w:val="28"/>
-                <w:lang w:val="en-US"/>
-              </w:rPr>
-            </w:pPr>
-            <w:r>
-              <w:rPr>
-                <w:sz w:val="28"/>
-                <w:szCs w:val="28"/>
-              </w:rPr>
-              <w:t>-</w:t>
-            </w:r>
-          </w:p>
-        </w:tc>
-      </w:tr>
-      <w:tr>
-        <w:tc>
-          <w:tcPr>
-            <w:tcW w:w="4673" w:type="dxa"/>
-          </w:tcPr>
-          <w:p>
-            <w:pPr>
-              <w:jc w:val="center"/>
-              <w:rPr>
-                <w:sz w:val="28"/>
-                <w:szCs w:val="28"/>
-              </w:rPr>
-            </w:pPr>
-            <w:r>
-              <w:rPr>
-                <w:sz w:val="28"/>
-                <w:szCs w:val="28"/>
-              </w:rPr>
-              <w:t>Аппаратура передачи данных комплект</w:t>
-            </w:r>
-          </w:p>
-        </w:tc>
-        <w:tc>
-          <w:tcPr>
-            <w:tcW w:w="4343" w:type="dxa"/>
-          </w:tcPr>
-          <w:p>
-            <w:pPr>
-              <w:jc w:val="center"/>
-              <w:rPr>
-                <w:sz w:val="28"/>
-                <w:szCs w:val="28"/>
-                <w:lang w:val="en-US"/>
-              </w:rPr>
-            </w:pPr>
-            <w:r>
-              <w:rPr>
-                <w:sz w:val="28"/>
-                <w:szCs w:val="28"/>
-              </w:rPr>
-              <w:t>1</w:t>
-            </w:r>
-            <w:r>
-              <w:rPr>
-                <w:sz w:val="28"/>
-                <w:szCs w:val="28"/>
-                <w:lang w:val="en-US"/>
-              </w:rPr>
-              <w:t>3</w:t>
+              </w:rPr>
+            </w:pPr>
+            <w:r>
+              <w:rPr>
+                <w:sz w:val="28"/>
+                <w:szCs w:val="28"/>
+              </w:rPr>
+              <w:t>7</w:t>
             </w:r>
           </w:p>
         </w:tc>
@@ -2365,7 +2452,7 @@
     </w:p>
     <w:tbl>
       <w:tblPr>
-        <w:tblStyle w:val="ac"/>
+        <w:tblStyle w:val="TableGrid"/>
         <w:tblpPr w:leftFromText="180" w:rightFromText="180" w:vertAnchor="page" w:horzAnchor="margin" w:tblpY="6852"/>
         <w:tblW w:w="0" w:type="auto"/>
         <w:tblLook w:val="04A0" w:firstRow="1" w:lastRow="0" w:firstColumn="1" w:lastColumn="0" w:noHBand="0" w:noVBand="1"/>
@@ -2416,23 +2503,7 @@
                 <w:sz w:val="28"/>
                 <w:szCs w:val="28"/>
               </w:rPr>
-              <w:t>Локомотивные радиостанции проездной связи р/</w:t>
-            </w:r>
-            <w:proofErr w:type="spellStart"/>
-            <w:r>
-              <w:rPr>
-                <w:sz w:val="28"/>
-                <w:szCs w:val="28"/>
-              </w:rPr>
-              <w:t>ст</w:t>
-            </w:r>
-            <w:proofErr w:type="spellEnd"/>
-            <w:r>
-              <w:rPr>
-                <w:sz w:val="28"/>
-                <w:szCs w:val="28"/>
-              </w:rPr>
-              <w:t xml:space="preserve"> &lt;&lt;чужих/своих&gt;&gt;</w:t>
+              <w:t>Локомотивные радиостанции проездной связи р/ст &lt;&lt;чужих/своих&gt;&gt;</w:t>
             </w:r>
           </w:p>
         </w:tc>
@@ -2476,17 +2547,8 @@
                 <w:sz w:val="28"/>
                 <w:szCs w:val="28"/>
               </w:rPr>
-              <w:t>Станционных радиостанций проездной радиосвязи р/</w:t>
-            </w:r>
-            <w:proofErr w:type="spellStart"/>
-            <w:r>
-              <w:rPr>
-                <w:sz w:val="28"/>
-                <w:szCs w:val="28"/>
-              </w:rPr>
-              <w:t>ст</w:t>
-            </w:r>
-            <w:proofErr w:type="spellEnd"/>
+              <w:t>Станционных радиостанций проездной радиосвязи р/ст</w:t>
+            </w:r>
           </w:p>
         </w:tc>
         <w:tc>
@@ -2573,17 +2635,8 @@
                 <w:sz w:val="28"/>
                 <w:szCs w:val="28"/>
               </w:rPr>
-              <w:t>Радиостанция стационарной станционный и ремонтные оперативной радиосвязи и возимые р/</w:t>
-            </w:r>
-            <w:proofErr w:type="spellStart"/>
-            <w:r>
-              <w:rPr>
-                <w:sz w:val="28"/>
-                <w:szCs w:val="28"/>
-              </w:rPr>
-              <w:t>ст</w:t>
-            </w:r>
-            <w:proofErr w:type="spellEnd"/>
+              <w:t>Радиостанция стационарной станционный и ремонтные оперативной радиосвязи и возимые р/ст</w:t>
+            </w:r>
           </w:p>
         </w:tc>
         <w:tc>
@@ -2655,7 +2708,7 @@
     </w:tbl>
     <w:tbl>
       <w:tblPr>
-        <w:tblStyle w:val="ac"/>
+        <w:tblStyle w:val="TableGrid"/>
         <w:tblpPr w:leftFromText="180" w:rightFromText="180" w:vertAnchor="page" w:horzAnchor="margin" w:tblpY="11906"/>
         <w:tblW w:w="0" w:type="auto"/>
         <w:tblLook w:val="04A0" w:firstRow="1" w:lastRow="0" w:firstColumn="1" w:lastColumn="0" w:noHBand="0" w:noVBand="1"/>
@@ -2708,22 +2761,13 @@
               </w:rPr>
               <w:t xml:space="preserve">Информационная система отправления поездов </w:t>
             </w:r>
-            <w:proofErr w:type="spellStart"/>
             <w:proofErr w:type="gramStart"/>
             <w:r>
               <w:rPr>
                 <w:sz w:val="28"/>
                 <w:szCs w:val="28"/>
               </w:rPr>
-              <w:t>знако</w:t>
-            </w:r>
-            <w:proofErr w:type="spellEnd"/>
-            <w:r>
-              <w:rPr>
-                <w:sz w:val="28"/>
-                <w:szCs w:val="28"/>
-              </w:rPr>
-              <w:t>-мест</w:t>
+              <w:t>знако-мест</w:t>
             </w:r>
             <w:proofErr w:type="gramEnd"/>
           </w:p>
@@ -2812,17 +2856,8 @@
                 <w:sz w:val="28"/>
                 <w:szCs w:val="28"/>
               </w:rPr>
-              <w:t xml:space="preserve">Переговорное устройство типа &lt;&lt;пассажир-кассир&gt;&gt; </w:t>
-            </w:r>
-            <w:proofErr w:type="spellStart"/>
-            <w:r>
-              <w:rPr>
-                <w:sz w:val="28"/>
-                <w:szCs w:val="28"/>
-              </w:rPr>
-              <w:t>шт</w:t>
-            </w:r>
-            <w:proofErr w:type="spellEnd"/>
+              <w:t>Переговорное устройство типа &lt;&lt;пассажир-кассир&gt;&gt; шт</w:t>
+            </w:r>
           </w:p>
         </w:tc>
         <w:tc>
@@ -2889,17 +2924,8 @@
                 <w:sz w:val="28"/>
                 <w:szCs w:val="28"/>
               </w:rPr>
-              <w:t xml:space="preserve">Персональный ЭВМ </w:t>
-            </w:r>
-            <w:proofErr w:type="spellStart"/>
-            <w:r>
-              <w:rPr>
-                <w:sz w:val="28"/>
-                <w:szCs w:val="28"/>
-              </w:rPr>
-              <w:t>шт</w:t>
-            </w:r>
-            <w:proofErr w:type="spellEnd"/>
+              <w:t>Персональный ЭВМ шт</w:t>
+            </w:r>
           </w:p>
         </w:tc>
         <w:tc>
@@ -2986,17 +3012,8 @@
                 <w:sz w:val="28"/>
                 <w:szCs w:val="28"/>
               </w:rPr>
-              <w:t xml:space="preserve">Печатающее устройство </w:t>
-            </w:r>
-            <w:proofErr w:type="spellStart"/>
-            <w:r>
-              <w:rPr>
-                <w:sz w:val="28"/>
-                <w:szCs w:val="28"/>
-              </w:rPr>
-              <w:t>шт</w:t>
-            </w:r>
-            <w:proofErr w:type="spellEnd"/>
+              <w:t>Печатающее устройство шт</w:t>
+            </w:r>
           </w:p>
         </w:tc>
         <w:tc>
@@ -3039,17 +3056,8 @@
                 <w:sz w:val="28"/>
                 <w:szCs w:val="28"/>
               </w:rPr>
-              <w:t xml:space="preserve">Дисплей разного назначения </w:t>
-            </w:r>
-            <w:proofErr w:type="spellStart"/>
-            <w:r>
-              <w:rPr>
-                <w:sz w:val="28"/>
-                <w:szCs w:val="28"/>
-              </w:rPr>
-              <w:t>шт</w:t>
-            </w:r>
-            <w:proofErr w:type="spellEnd"/>
+              <w:t>Дисплей разного назначения шт</w:t>
+            </w:r>
           </w:p>
         </w:tc>
         <w:tc>
@@ -3138,7 +3146,7 @@
     </w:p>
     <w:tbl>
       <w:tblPr>
-        <w:tblStyle w:val="ac"/>
+        <w:tblStyle w:val="TableGrid"/>
         <w:tblpPr w:leftFromText="180" w:rightFromText="180" w:vertAnchor="page" w:horzAnchor="margin" w:tblpY="678"/>
         <w:tblW w:w="0" w:type="auto"/>
         <w:tblLook w:val="04A0" w:firstRow="1" w:lastRow="0" w:firstColumn="1" w:lastColumn="0" w:noHBand="0" w:noVBand="1"/>
@@ -3376,7 +3384,6 @@
               </w:rPr>
               <w:t xml:space="preserve">Цифровые оконечные оконченные </w:t>
             </w:r>
-            <w:proofErr w:type="spellStart"/>
             <w:proofErr w:type="gramStart"/>
             <w:r>
               <w:rPr>
@@ -3385,7 +3392,6 @@
               </w:rPr>
               <w:t>полукомплекты,канал</w:t>
             </w:r>
-            <w:proofErr w:type="spellEnd"/>
             <w:proofErr w:type="gramEnd"/>
             <w:r>
               <w:rPr>
@@ -3514,7 +3520,6 @@
               </w:rPr>
               <w:t xml:space="preserve">Аналоговые оконечные оконченные </w:t>
             </w:r>
-            <w:proofErr w:type="spellStart"/>
             <w:proofErr w:type="gramStart"/>
             <w:r>
               <w:rPr>
@@ -3523,7 +3528,6 @@
               </w:rPr>
               <w:t>полукомплекты,канал</w:t>
             </w:r>
-            <w:proofErr w:type="spellEnd"/>
             <w:proofErr w:type="gramEnd"/>
             <w:r>
               <w:rPr>
@@ -3895,7 +3899,6 @@
               </w:rPr>
               <w:t xml:space="preserve">Промежуточные пункты </w:t>
             </w:r>
-            <w:proofErr w:type="spellStart"/>
             <w:proofErr w:type="gramStart"/>
             <w:r>
               <w:rPr>
@@ -3904,7 +3907,6 @@
               </w:rPr>
               <w:t>ОТС,промпункт</w:t>
             </w:r>
-            <w:proofErr w:type="spellEnd"/>
             <w:proofErr w:type="gramEnd"/>
           </w:p>
         </w:tc>
@@ -4144,17 +4146,8 @@
                 <w:sz w:val="28"/>
                 <w:szCs w:val="28"/>
               </w:rPr>
-              <w:t>Радиостанции стационарные ПРС, р/</w:t>
-            </w:r>
-            <w:proofErr w:type="spellStart"/>
-            <w:r>
-              <w:rPr>
-                <w:sz w:val="28"/>
-                <w:szCs w:val="28"/>
-              </w:rPr>
-              <w:t>ст</w:t>
-            </w:r>
-            <w:proofErr w:type="spellEnd"/>
+              <w:t>Радиостанции стационарные ПРС, р/ст</w:t>
+            </w:r>
           </w:p>
         </w:tc>
         <w:tc>
@@ -4273,17 +4266,8 @@
                 <w:sz w:val="28"/>
                 <w:szCs w:val="28"/>
               </w:rPr>
-              <w:t>Радиостанции стационарные СРС, р/</w:t>
-            </w:r>
-            <w:proofErr w:type="spellStart"/>
-            <w:r>
-              <w:rPr>
-                <w:sz w:val="28"/>
-                <w:szCs w:val="28"/>
-              </w:rPr>
-              <w:t>ст</w:t>
-            </w:r>
-            <w:proofErr w:type="spellEnd"/>
+              <w:t>Радиостанции стационарные СРС, р/ст</w:t>
+            </w:r>
           </w:p>
         </w:tc>
         <w:tc>
@@ -4402,23 +4386,7 @@
                 <w:sz w:val="28"/>
                 <w:szCs w:val="28"/>
               </w:rPr>
-              <w:t xml:space="preserve">Аппаратура </w:t>
-            </w:r>
-            <w:proofErr w:type="spellStart"/>
-            <w:r>
-              <w:rPr>
-                <w:sz w:val="28"/>
-                <w:szCs w:val="28"/>
-              </w:rPr>
-              <w:t>регестрации</w:t>
-            </w:r>
-            <w:proofErr w:type="spellEnd"/>
-            <w:r>
-              <w:rPr>
-                <w:sz w:val="28"/>
-                <w:szCs w:val="28"/>
-              </w:rPr>
-              <w:t xml:space="preserve"> служебных переговоров, комплект</w:t>
+              <w:t>Аппаратура регестрации служебных переговоров, комплект</w:t>
             </w:r>
           </w:p>
         </w:tc>
@@ -4536,39 +4504,25 @@
           <w:szCs w:val="28"/>
         </w:rPr>
       </w:pPr>
-      <w:r>
-        <w:rPr>
-          <w:sz w:val="28"/>
-          <w:szCs w:val="28"/>
-        </w:rPr>
-        <w:t>Таблица3-Техническая оснащенность промежуточных станций</w:t>
-      </w:r>
-      <w:r>
-        <w:rPr>
-          <w:sz w:val="28"/>
-          <w:szCs w:val="28"/>
-        </w:rPr>
-        <w:t>.</w:t>
-      </w:r>
     </w:p>
     <w:tbl>
       <w:tblPr>
-        <w:tblStyle w:val="ac"/>
-        <w:tblpPr w:leftFromText="180" w:rightFromText="180" w:vertAnchor="text" w:horzAnchor="page" w:tblpX="1524" w:tblpY="182"/>
+        <w:tblStyle w:val="TableGrid"/>
+        <w:tblpPr w:leftFromText="180" w:rightFromText="180" w:vertAnchor="text" w:horzAnchor="margin" w:tblpY="379"/>
         <w:tblW w:w="0" w:type="auto"/>
         <w:tblLook w:val="04A0" w:firstRow="1" w:lastRow="0" w:firstColumn="1" w:lastColumn="0" w:noHBand="0" w:noVBand="1"/>
       </w:tblPr>
       <w:tblGrid>
-        <w:gridCol w:w="4422"/>
-        <w:gridCol w:w="4135"/>
+        <w:gridCol w:w="4765"/>
+        <w:gridCol w:w="4154"/>
       </w:tblGrid>
       <w:tr>
         <w:trPr>
-          <w:trHeight w:val="163"/>
+          <w:trHeight w:val="159"/>
         </w:trPr>
         <w:tc>
           <w:tcPr>
-            <w:tcW w:w="4422" w:type="dxa"/>
+            <w:tcW w:w="4765" w:type="dxa"/>
             <w:vMerge w:val="restart"/>
           </w:tcPr>
           <w:p>
@@ -4594,7 +4548,7 @@
         </w:tc>
         <w:tc>
           <w:tcPr>
-            <w:tcW w:w="4135" w:type="dxa"/>
+            <w:tcW w:w="4154" w:type="dxa"/>
           </w:tcPr>
           <w:p>
             <w:pPr>
@@ -4619,11 +4573,11 @@
       </w:tr>
       <w:tr>
         <w:trPr>
-          <w:trHeight w:val="161"/>
+          <w:trHeight w:val="157"/>
         </w:trPr>
         <w:tc>
           <w:tcPr>
-            <w:tcW w:w="4422" w:type="dxa"/>
+            <w:tcW w:w="4765" w:type="dxa"/>
             <w:vMerge/>
           </w:tcPr>
           <w:p>
@@ -4641,7 +4595,7 @@
         </w:tc>
         <w:tc>
           <w:tcPr>
-            <w:tcW w:w="4135" w:type="dxa"/>
+            <w:tcW w:w="4154" w:type="dxa"/>
           </w:tcPr>
           <w:p>
             <w:pPr>
@@ -4666,11 +4620,11 @@
       </w:tr>
       <w:tr>
         <w:trPr>
-          <w:trHeight w:val="720"/>
+          <w:trHeight w:val="704"/>
         </w:trPr>
         <w:tc>
           <w:tcPr>
-            <w:tcW w:w="4422" w:type="dxa"/>
+            <w:tcW w:w="4765" w:type="dxa"/>
           </w:tcPr>
           <w:p>
             <w:pPr>
@@ -4688,27 +4642,13 @@
                 <w:sz w:val="28"/>
                 <w:szCs w:val="28"/>
               </w:rPr>
-              <w:t xml:space="preserve">Срок </w:t>
-            </w:r>
-            <w:r>
-              <w:rPr>
-                <w:sz w:val="28"/>
-                <w:szCs w:val="28"/>
-              </w:rPr>
-              <w:t>службы устройств</w:t>
-            </w:r>
-            <w:r>
-              <w:rPr>
-                <w:sz w:val="28"/>
-                <w:szCs w:val="28"/>
-              </w:rPr>
-              <w:t xml:space="preserve"> радиосвязи, лет</w:t>
-            </w:r>
-          </w:p>
-        </w:tc>
-        <w:tc>
-          <w:tcPr>
-            <w:tcW w:w="4135" w:type="dxa"/>
+              <w:t>Срок службы устройств радиосвязи, лет</w:t>
+            </w:r>
+          </w:p>
+        </w:tc>
+        <w:tc>
+          <w:tcPr>
+            <w:tcW w:w="4154" w:type="dxa"/>
           </w:tcPr>
           <w:p>
             <w:pPr>
@@ -4733,11 +4673,11 @@
       </w:tr>
       <w:tr>
         <w:trPr>
-          <w:trHeight w:val="706"/>
+          <w:trHeight w:val="691"/>
         </w:trPr>
         <w:tc>
           <w:tcPr>
-            <w:tcW w:w="4422" w:type="dxa"/>
+            <w:tcW w:w="4765" w:type="dxa"/>
           </w:tcPr>
           <w:p>
             <w:pPr>
@@ -4755,36 +4695,13 @@
                 <w:sz w:val="28"/>
                 <w:szCs w:val="28"/>
               </w:rPr>
-              <w:t xml:space="preserve">Количество приборов бесконтактной </w:t>
-            </w:r>
-            <w:r>
-              <w:rPr>
-                <w:sz w:val="28"/>
-                <w:szCs w:val="28"/>
-              </w:rPr>
-              <w:t>аппаратуры связи</w:t>
-            </w:r>
-            <w:r>
-              <w:rPr>
-                <w:sz w:val="28"/>
-                <w:szCs w:val="28"/>
-              </w:rPr>
-              <w:t xml:space="preserve">, </w:t>
-            </w:r>
-            <w:proofErr w:type="spellStart"/>
-            <w:r>
-              <w:rPr>
-                <w:sz w:val="28"/>
-                <w:szCs w:val="28"/>
-              </w:rPr>
-              <w:t>шт</w:t>
-            </w:r>
-            <w:proofErr w:type="spellEnd"/>
-          </w:p>
-        </w:tc>
-        <w:tc>
-          <w:tcPr>
-            <w:tcW w:w="4135" w:type="dxa"/>
+              <w:t>Количество приборов бесконтактной аппаратуры связи, шт</w:t>
+            </w:r>
+          </w:p>
+        </w:tc>
+        <w:tc>
+          <w:tcPr>
+            <w:tcW w:w="4154" w:type="dxa"/>
           </w:tcPr>
           <w:p>
             <w:pPr>
@@ -4809,11 +4726,11 @@
       </w:tr>
       <w:tr>
         <w:trPr>
-          <w:trHeight w:val="720"/>
+          <w:trHeight w:val="704"/>
         </w:trPr>
         <w:tc>
           <w:tcPr>
-            <w:tcW w:w="4422" w:type="dxa"/>
+            <w:tcW w:w="4765" w:type="dxa"/>
           </w:tcPr>
           <w:p>
             <w:pPr>
@@ -4831,22 +4748,13 @@
                 <w:sz w:val="28"/>
                 <w:szCs w:val="28"/>
               </w:rPr>
-              <w:t xml:space="preserve">Количество измерительных приборов в дистанции, </w:t>
-            </w:r>
-            <w:proofErr w:type="spellStart"/>
-            <w:r>
-              <w:rPr>
-                <w:sz w:val="28"/>
-                <w:szCs w:val="28"/>
-              </w:rPr>
-              <w:t>шт</w:t>
-            </w:r>
-            <w:proofErr w:type="spellEnd"/>
-          </w:p>
-        </w:tc>
-        <w:tc>
-          <w:tcPr>
-            <w:tcW w:w="4135" w:type="dxa"/>
+              <w:t>Количество измерительных приборов в дистанции, шт</w:t>
+            </w:r>
+          </w:p>
+        </w:tc>
+        <w:tc>
+          <w:tcPr>
+            <w:tcW w:w="4154" w:type="dxa"/>
           </w:tcPr>
           <w:p>
             <w:pPr>
@@ -4871,11 +4779,11 @@
       </w:tr>
       <w:tr>
         <w:trPr>
-          <w:trHeight w:val="1073"/>
+          <w:trHeight w:val="1050"/>
         </w:trPr>
         <w:tc>
           <w:tcPr>
-            <w:tcW w:w="4422" w:type="dxa"/>
+            <w:tcW w:w="4765" w:type="dxa"/>
           </w:tcPr>
           <w:p>
             <w:pPr>
@@ -4893,27 +4801,13 @@
                 <w:sz w:val="28"/>
                 <w:szCs w:val="28"/>
               </w:rPr>
-              <w:t xml:space="preserve">Затраты времени и </w:t>
-            </w:r>
-            <w:r>
-              <w:rPr>
-                <w:sz w:val="28"/>
-                <w:szCs w:val="28"/>
-              </w:rPr>
-              <w:t>на капремонт,</w:t>
-            </w:r>
-            <w:r>
-              <w:rPr>
-                <w:sz w:val="28"/>
-                <w:szCs w:val="28"/>
-              </w:rPr>
-              <w:t xml:space="preserve"> и на сопутствующие ему работы и &lt;&lt;окна&gt;&gt;, чел.-ч</w:t>
-            </w:r>
-          </w:p>
-        </w:tc>
-        <w:tc>
-          <w:tcPr>
-            <w:tcW w:w="4135" w:type="dxa"/>
+              <w:t>Затраты времени и на капремонт, и на сопутствующие ему работы и &lt;&lt;окна&gt;&gt;, чел.-ч</w:t>
+            </w:r>
+          </w:p>
+        </w:tc>
+        <w:tc>
+          <w:tcPr>
+            <w:tcW w:w="4154" w:type="dxa"/>
           </w:tcPr>
           <w:p>
             <w:pPr>
@@ -4937,6 +4831,36 @@
         </w:tc>
       </w:tr>
     </w:tbl>
+    <w:p>
+      <w:pPr>
+        <w:spacing w:after="160" w:line="259" w:lineRule="auto"/>
+        <w:rPr>
+          <w:sz w:val="28"/>
+          <w:szCs w:val="28"/>
+        </w:rPr>
+      </w:pPr>
+      <w:r>
+        <w:rPr>
+          <w:sz w:val="28"/>
+          <w:szCs w:val="28"/>
+        </w:rPr>
+        <w:t xml:space="preserve"> </w:t>
+      </w:r>
+      <w:r>
+        <w:rPr>
+          <w:sz w:val="28"/>
+          <w:szCs w:val="28"/>
+        </w:rPr>
+        <w:t>Таблица3-Техническая оснащенность промежуточных станций</w:t>
+      </w:r>
+      <w:r>
+        <w:rPr>
+          <w:sz w:val="28"/>
+          <w:szCs w:val="28"/>
+        </w:rPr>
+        <w:t>.</w:t>
+      </w:r>
+    </w:p>
     <w:p>
       <w:pPr>
         <w:spacing w:after="160" w:line="259" w:lineRule="auto"/>
@@ -4996,16 +4920,7 @@
           <w:szCs w:val="28"/>
           <w:u w:val="double"/>
         </w:rPr>
-        <w:t xml:space="preserve"> </w:t>
-      </w:r>
-      <w:r>
-        <w:rPr>
-          <w:color w:val="000000"/>
-          <w:sz w:val="28"/>
-          <w:szCs w:val="28"/>
-          <w:u w:val="double"/>
-        </w:rPr>
-        <w:t xml:space="preserve">Фадеев </w:t>
+        <w:t xml:space="preserve"> Фадеев </w:t>
       </w:r>
       <w:proofErr w:type="gramStart"/>
       <w:r>
@@ -5022,10 +4937,7 @@
         <w:t xml:space="preserve"> </w:t>
       </w:r>
       <w:r>
-        <w:t>_________</w:t>
-      </w:r>
-      <w:r>
-        <w:t>__</w:t>
+        <w:t>___________</w:t>
       </w:r>
       <w:r>
         <w:t>_____</w:t>
@@ -5040,47 +4952,6 @@
         <w:rPr>
           <w:b/>
           <w:bCs/>
-        </w:rPr>
-      </w:pPr>
-      <w:r>
-        <w:rPr>
-          <w:b/>
-          <w:bCs/>
-        </w:rPr>
-        <w:br w:type="page"/>
-      </w:r>
-    </w:p>
-    <w:p>
-      <w:pPr>
-        <w:spacing w:after="160" w:line="259" w:lineRule="auto"/>
-        <w:rPr>
-          <w:b/>
-          <w:bCs/>
-        </w:rPr>
-      </w:pPr>
-    </w:p>
-    <w:p>
-      <w:pPr>
-        <w:spacing w:after="160" w:line="259" w:lineRule="auto"/>
-        <w:rPr>
-          <w:b/>
-          <w:bCs/>
-        </w:rPr>
-      </w:pPr>
-    </w:p>
-    <w:p>
-      <w:pPr>
-        <w:spacing w:after="160" w:line="259" w:lineRule="auto"/>
-        <w:rPr>
-          <w:b/>
-          <w:bCs/>
-        </w:rPr>
-      </w:pPr>
-    </w:p>
-    <w:p>
-      <w:pPr>
-        <w:rPr>
-          <w:color w:val="000000"/>
         </w:rPr>
       </w:pPr>
     </w:p>
@@ -5491,7 +5362,7 @@
     <w:lsdException w:name="Unresolved Mention" w:semiHidden="1" w:unhideWhenUsed="1"/>
     <w:lsdException w:name="Smart Link" w:semiHidden="1" w:unhideWhenUsed="1"/>
   </w:latentStyles>
-  <w:style w:type="paragraph" w:default="1" w:styleId="a">
+  <w:style w:type="paragraph" w:default="1" w:styleId="Normal">
     <w:name w:val="Normal"/>
     <w:qFormat/>
     <w:rsid w:val="00A0203E"/>
@@ -5507,11 +5378,11 @@
       <w14:ligatures w14:val="none"/>
     </w:rPr>
   </w:style>
-  <w:style w:type="paragraph" w:styleId="1">
+  <w:style w:type="paragraph" w:styleId="Heading1">
     <w:name w:val="heading 1"/>
-    <w:basedOn w:val="a"/>
-    <w:next w:val="a"/>
-    <w:link w:val="10"/>
+    <w:basedOn w:val="Normal"/>
+    <w:next w:val="Normal"/>
+    <w:link w:val="Heading1Char"/>
     <w:uiPriority w:val="9"/>
     <w:qFormat/>
     <w:rsid w:val="004B0894"/>
@@ -5531,11 +5402,11 @@
       <w14:ligatures w14:val="standardContextual"/>
     </w:rPr>
   </w:style>
-  <w:style w:type="paragraph" w:styleId="2">
+  <w:style w:type="paragraph" w:styleId="Heading2">
     <w:name w:val="heading 2"/>
-    <w:basedOn w:val="a"/>
-    <w:next w:val="a"/>
-    <w:link w:val="20"/>
+    <w:basedOn w:val="Normal"/>
+    <w:next w:val="Normal"/>
+    <w:link w:val="Heading2Char"/>
     <w:uiPriority w:val="9"/>
     <w:semiHidden/>
     <w:unhideWhenUsed/>
@@ -5557,11 +5428,11 @@
       <w14:ligatures w14:val="standardContextual"/>
     </w:rPr>
   </w:style>
-  <w:style w:type="paragraph" w:styleId="3">
+  <w:style w:type="paragraph" w:styleId="Heading3">
     <w:name w:val="heading 3"/>
-    <w:basedOn w:val="a"/>
-    <w:next w:val="a"/>
-    <w:link w:val="30"/>
+    <w:basedOn w:val="Normal"/>
+    <w:next w:val="Normal"/>
+    <w:link w:val="Heading3Char"/>
     <w:uiPriority w:val="9"/>
     <w:semiHidden/>
     <w:unhideWhenUsed/>
@@ -5583,11 +5454,11 @@
       <w14:ligatures w14:val="standardContextual"/>
     </w:rPr>
   </w:style>
-  <w:style w:type="paragraph" w:styleId="4">
+  <w:style w:type="paragraph" w:styleId="Heading4">
     <w:name w:val="heading 4"/>
-    <w:basedOn w:val="a"/>
-    <w:next w:val="a"/>
-    <w:link w:val="40"/>
+    <w:basedOn w:val="Normal"/>
+    <w:next w:val="Normal"/>
+    <w:link w:val="Heading4Char"/>
     <w:uiPriority w:val="9"/>
     <w:semiHidden/>
     <w:unhideWhenUsed/>
@@ -5611,11 +5482,11 @@
       <w14:ligatures w14:val="standardContextual"/>
     </w:rPr>
   </w:style>
-  <w:style w:type="paragraph" w:styleId="5">
+  <w:style w:type="paragraph" w:styleId="Heading5">
     <w:name w:val="heading 5"/>
-    <w:basedOn w:val="a"/>
-    <w:next w:val="a"/>
-    <w:link w:val="50"/>
+    <w:basedOn w:val="Normal"/>
+    <w:next w:val="Normal"/>
+    <w:link w:val="Heading5Char"/>
     <w:uiPriority w:val="9"/>
     <w:semiHidden/>
     <w:unhideWhenUsed/>
@@ -5637,11 +5508,11 @@
       <w14:ligatures w14:val="standardContextual"/>
     </w:rPr>
   </w:style>
-  <w:style w:type="paragraph" w:styleId="6">
+  <w:style w:type="paragraph" w:styleId="Heading6">
     <w:name w:val="heading 6"/>
-    <w:basedOn w:val="a"/>
-    <w:next w:val="a"/>
-    <w:link w:val="60"/>
+    <w:basedOn w:val="Normal"/>
+    <w:next w:val="Normal"/>
+    <w:link w:val="Heading6Char"/>
     <w:uiPriority w:val="9"/>
     <w:semiHidden/>
     <w:unhideWhenUsed/>
@@ -5665,11 +5536,11 @@
       <w14:ligatures w14:val="standardContextual"/>
     </w:rPr>
   </w:style>
-  <w:style w:type="paragraph" w:styleId="7">
+  <w:style w:type="paragraph" w:styleId="Heading7">
     <w:name w:val="heading 7"/>
-    <w:basedOn w:val="a"/>
-    <w:next w:val="a"/>
-    <w:link w:val="70"/>
+    <w:basedOn w:val="Normal"/>
+    <w:next w:val="Normal"/>
+    <w:link w:val="Heading7Char"/>
     <w:uiPriority w:val="9"/>
     <w:semiHidden/>
     <w:unhideWhenUsed/>
@@ -5691,11 +5562,11 @@
       <w14:ligatures w14:val="standardContextual"/>
     </w:rPr>
   </w:style>
-  <w:style w:type="paragraph" w:styleId="8">
+  <w:style w:type="paragraph" w:styleId="Heading8">
     <w:name w:val="heading 8"/>
-    <w:basedOn w:val="a"/>
-    <w:next w:val="a"/>
-    <w:link w:val="80"/>
+    <w:basedOn w:val="Normal"/>
+    <w:next w:val="Normal"/>
+    <w:link w:val="Heading8Char"/>
     <w:uiPriority w:val="9"/>
     <w:semiHidden/>
     <w:unhideWhenUsed/>
@@ -5719,11 +5590,11 @@
       <w14:ligatures w14:val="standardContextual"/>
     </w:rPr>
   </w:style>
-  <w:style w:type="paragraph" w:styleId="9">
+  <w:style w:type="paragraph" w:styleId="Heading9">
     <w:name w:val="heading 9"/>
-    <w:basedOn w:val="a"/>
-    <w:next w:val="a"/>
-    <w:link w:val="90"/>
+    <w:basedOn w:val="Normal"/>
+    <w:next w:val="Normal"/>
+    <w:link w:val="Heading9Char"/>
     <w:uiPriority w:val="9"/>
     <w:semiHidden/>
     <w:unhideWhenUsed/>
@@ -5745,12 +5616,13 @@
       <w14:ligatures w14:val="standardContextual"/>
     </w:rPr>
   </w:style>
-  <w:style w:type="character" w:default="1" w:styleId="a0">
+  <w:style w:type="character" w:default="1" w:styleId="DefaultParagraphFont">
     <w:name w:val="Default Paragraph Font"/>
     <w:uiPriority w:val="1"/>
+    <w:semiHidden/>
     <w:unhideWhenUsed/>
   </w:style>
-  <w:style w:type="table" w:default="1" w:styleId="a1">
+  <w:style w:type="table" w:default="1" w:styleId="TableNormal">
     <w:name w:val="Normal Table"/>
     <w:uiPriority w:val="99"/>
     <w:semiHidden/>
@@ -5765,16 +5637,16 @@
       </w:tblCellMar>
     </w:tblPr>
   </w:style>
-  <w:style w:type="numbering" w:default="1" w:styleId="a2">
+  <w:style w:type="numbering" w:default="1" w:styleId="NoList">
     <w:name w:val="No List"/>
     <w:uiPriority w:val="99"/>
     <w:semiHidden/>
     <w:unhideWhenUsed/>
   </w:style>
-  <w:style w:type="character" w:customStyle="1" w:styleId="10">
-    <w:name w:val="Заголовок 1 Знак"/>
-    <w:basedOn w:val="a0"/>
-    <w:link w:val="1"/>
+  <w:style w:type="character" w:customStyle="1" w:styleId="Heading1Char">
+    <w:name w:val="Heading 1 Char"/>
+    <w:basedOn w:val="DefaultParagraphFont"/>
+    <w:link w:val="Heading1"/>
     <w:uiPriority w:val="9"/>
     <w:rsid w:val="004B0894"/>
     <w:rPr>
@@ -5784,10 +5656,10 @@
       <w:szCs w:val="40"/>
     </w:rPr>
   </w:style>
-  <w:style w:type="character" w:customStyle="1" w:styleId="20">
-    <w:name w:val="Заголовок 2 Знак"/>
-    <w:basedOn w:val="a0"/>
-    <w:link w:val="2"/>
+  <w:style w:type="character" w:customStyle="1" w:styleId="Heading2Char">
+    <w:name w:val="Heading 2 Char"/>
+    <w:basedOn w:val="DefaultParagraphFont"/>
+    <w:link w:val="Heading2"/>
     <w:uiPriority w:val="9"/>
     <w:semiHidden/>
     <w:rsid w:val="004B0894"/>
@@ -5798,10 +5670,10 @@
       <w:szCs w:val="32"/>
     </w:rPr>
   </w:style>
-  <w:style w:type="character" w:customStyle="1" w:styleId="30">
-    <w:name w:val="Заголовок 3 Знак"/>
-    <w:basedOn w:val="a0"/>
-    <w:link w:val="3"/>
+  <w:style w:type="character" w:customStyle="1" w:styleId="Heading3Char">
+    <w:name w:val="Heading 3 Char"/>
+    <w:basedOn w:val="DefaultParagraphFont"/>
+    <w:link w:val="Heading3"/>
     <w:uiPriority w:val="9"/>
     <w:semiHidden/>
     <w:rsid w:val="004B0894"/>
@@ -5812,10 +5684,10 @@
       <w:szCs w:val="28"/>
     </w:rPr>
   </w:style>
-  <w:style w:type="character" w:customStyle="1" w:styleId="40">
-    <w:name w:val="Заголовок 4 Знак"/>
-    <w:basedOn w:val="a0"/>
-    <w:link w:val="4"/>
+  <w:style w:type="character" w:customStyle="1" w:styleId="Heading4Char">
+    <w:name w:val="Heading 4 Char"/>
+    <w:basedOn w:val="DefaultParagraphFont"/>
+    <w:link w:val="Heading4"/>
     <w:uiPriority w:val="9"/>
     <w:semiHidden/>
     <w:rsid w:val="004B0894"/>
@@ -5826,10 +5698,10 @@
       <w:color w:val="2F5496" w:themeColor="accent1" w:themeShade="BF"/>
     </w:rPr>
   </w:style>
-  <w:style w:type="character" w:customStyle="1" w:styleId="50">
-    <w:name w:val="Заголовок 5 Знак"/>
-    <w:basedOn w:val="a0"/>
-    <w:link w:val="5"/>
+  <w:style w:type="character" w:customStyle="1" w:styleId="Heading5Char">
+    <w:name w:val="Heading 5 Char"/>
+    <w:basedOn w:val="DefaultParagraphFont"/>
+    <w:link w:val="Heading5"/>
     <w:uiPriority w:val="9"/>
     <w:semiHidden/>
     <w:rsid w:val="004B0894"/>
@@ -5838,10 +5710,10 @@
       <w:color w:val="2F5496" w:themeColor="accent1" w:themeShade="BF"/>
     </w:rPr>
   </w:style>
-  <w:style w:type="character" w:customStyle="1" w:styleId="60">
-    <w:name w:val="Заголовок 6 Знак"/>
-    <w:basedOn w:val="a0"/>
-    <w:link w:val="6"/>
+  <w:style w:type="character" w:customStyle="1" w:styleId="Heading6Char">
+    <w:name w:val="Heading 6 Char"/>
+    <w:basedOn w:val="DefaultParagraphFont"/>
+    <w:link w:val="Heading6"/>
     <w:uiPriority w:val="9"/>
     <w:semiHidden/>
     <w:rsid w:val="004B0894"/>
@@ -5852,10 +5724,10 @@
       <w:color w:val="595959" w:themeColor="text1" w:themeTint="A6"/>
     </w:rPr>
   </w:style>
-  <w:style w:type="character" w:customStyle="1" w:styleId="70">
-    <w:name w:val="Заголовок 7 Знак"/>
-    <w:basedOn w:val="a0"/>
-    <w:link w:val="7"/>
+  <w:style w:type="character" w:customStyle="1" w:styleId="Heading7Char">
+    <w:name w:val="Heading 7 Char"/>
+    <w:basedOn w:val="DefaultParagraphFont"/>
+    <w:link w:val="Heading7"/>
     <w:uiPriority w:val="9"/>
     <w:semiHidden/>
     <w:rsid w:val="004B0894"/>
@@ -5864,10 +5736,10 @@
       <w:color w:val="595959" w:themeColor="text1" w:themeTint="A6"/>
     </w:rPr>
   </w:style>
-  <w:style w:type="character" w:customStyle="1" w:styleId="80">
-    <w:name w:val="Заголовок 8 Знак"/>
-    <w:basedOn w:val="a0"/>
-    <w:link w:val="8"/>
+  <w:style w:type="character" w:customStyle="1" w:styleId="Heading8Char">
+    <w:name w:val="Heading 8 Char"/>
+    <w:basedOn w:val="DefaultParagraphFont"/>
+    <w:link w:val="Heading8"/>
     <w:uiPriority w:val="9"/>
     <w:semiHidden/>
     <w:rsid w:val="004B0894"/>
@@ -5878,10 +5750,10 @@
       <w:color w:val="272727" w:themeColor="text1" w:themeTint="D8"/>
     </w:rPr>
   </w:style>
-  <w:style w:type="character" w:customStyle="1" w:styleId="90">
-    <w:name w:val="Заголовок 9 Знак"/>
-    <w:basedOn w:val="a0"/>
-    <w:link w:val="9"/>
+  <w:style w:type="character" w:customStyle="1" w:styleId="Heading9Char">
+    <w:name w:val="Heading 9 Char"/>
+    <w:basedOn w:val="DefaultParagraphFont"/>
+    <w:link w:val="Heading9"/>
     <w:uiPriority w:val="9"/>
     <w:semiHidden/>
     <w:rsid w:val="004B0894"/>
@@ -5890,11 +5762,11 @@
       <w:color w:val="272727" w:themeColor="text1" w:themeTint="D8"/>
     </w:rPr>
   </w:style>
-  <w:style w:type="paragraph" w:styleId="a3">
+  <w:style w:type="paragraph" w:styleId="Title">
     <w:name w:val="Title"/>
-    <w:basedOn w:val="a"/>
-    <w:next w:val="a"/>
-    <w:link w:val="a4"/>
+    <w:basedOn w:val="Normal"/>
+    <w:next w:val="Normal"/>
+    <w:link w:val="TitleChar"/>
     <w:uiPriority w:val="10"/>
     <w:qFormat/>
     <w:rsid w:val="004B0894"/>
@@ -5912,10 +5784,10 @@
       <w14:ligatures w14:val="standardContextual"/>
     </w:rPr>
   </w:style>
-  <w:style w:type="character" w:customStyle="1" w:styleId="a4">
-    <w:name w:val="Заголовок Знак"/>
-    <w:basedOn w:val="a0"/>
-    <w:link w:val="a3"/>
+  <w:style w:type="character" w:customStyle="1" w:styleId="TitleChar">
+    <w:name w:val="Title Char"/>
+    <w:basedOn w:val="DefaultParagraphFont"/>
+    <w:link w:val="Title"/>
     <w:uiPriority w:val="10"/>
     <w:rsid w:val="004B0894"/>
     <w:rPr>
@@ -5926,11 +5798,11 @@
       <w:szCs w:val="56"/>
     </w:rPr>
   </w:style>
-  <w:style w:type="paragraph" w:styleId="a5">
+  <w:style w:type="paragraph" w:styleId="Subtitle">
     <w:name w:val="Subtitle"/>
-    <w:basedOn w:val="a"/>
-    <w:next w:val="a"/>
-    <w:link w:val="a6"/>
+    <w:basedOn w:val="Normal"/>
+    <w:next w:val="Normal"/>
+    <w:link w:val="SubtitleChar"/>
     <w:uiPriority w:val="11"/>
     <w:qFormat/>
     <w:rsid w:val="004B0894"/>
@@ -5951,10 +5823,10 @@
       <w14:ligatures w14:val="standardContextual"/>
     </w:rPr>
   </w:style>
-  <w:style w:type="character" w:customStyle="1" w:styleId="a6">
-    <w:name w:val="Подзаголовок Знак"/>
-    <w:basedOn w:val="a0"/>
-    <w:link w:val="a5"/>
+  <w:style w:type="character" w:customStyle="1" w:styleId="SubtitleChar">
+    <w:name w:val="Subtitle Char"/>
+    <w:basedOn w:val="DefaultParagraphFont"/>
+    <w:link w:val="Subtitle"/>
     <w:uiPriority w:val="11"/>
     <w:rsid w:val="004B0894"/>
     <w:rPr>
@@ -5965,11 +5837,11 @@
       <w:szCs w:val="28"/>
     </w:rPr>
   </w:style>
-  <w:style w:type="paragraph" w:styleId="21">
+  <w:style w:type="paragraph" w:styleId="Quote">
     <w:name w:val="Quote"/>
-    <w:basedOn w:val="a"/>
-    <w:next w:val="a"/>
-    <w:link w:val="22"/>
+    <w:basedOn w:val="Normal"/>
+    <w:next w:val="Normal"/>
+    <w:link w:val="QuoteChar"/>
     <w:uiPriority w:val="29"/>
     <w:qFormat/>
     <w:rsid w:val="004B0894"/>
@@ -5989,10 +5861,10 @@
       <w14:ligatures w14:val="standardContextual"/>
     </w:rPr>
   </w:style>
-  <w:style w:type="character" w:customStyle="1" w:styleId="22">
-    <w:name w:val="Цитата 2 Знак"/>
-    <w:basedOn w:val="a0"/>
-    <w:link w:val="21"/>
+  <w:style w:type="character" w:customStyle="1" w:styleId="QuoteChar">
+    <w:name w:val="Quote Char"/>
+    <w:basedOn w:val="DefaultParagraphFont"/>
+    <w:link w:val="Quote"/>
     <w:uiPriority w:val="29"/>
     <w:rsid w:val="004B0894"/>
     <w:rPr>
@@ -6001,9 +5873,9 @@
       <w:color w:val="404040" w:themeColor="text1" w:themeTint="BF"/>
     </w:rPr>
   </w:style>
-  <w:style w:type="paragraph" w:styleId="a7">
+  <w:style w:type="paragraph" w:styleId="ListParagraph">
     <w:name w:val="List Paragraph"/>
-    <w:basedOn w:val="a"/>
+    <w:basedOn w:val="Normal"/>
     <w:uiPriority w:val="34"/>
     <w:qFormat/>
     <w:rsid w:val="004B0894"/>
@@ -6021,9 +5893,9 @@
       <w14:ligatures w14:val="standardContextual"/>
     </w:rPr>
   </w:style>
-  <w:style w:type="character" w:styleId="a8">
+  <w:style w:type="character" w:styleId="IntenseEmphasis">
     <w:name w:val="Intense Emphasis"/>
-    <w:basedOn w:val="a0"/>
+    <w:basedOn w:val="DefaultParagraphFont"/>
     <w:uiPriority w:val="21"/>
     <w:qFormat/>
     <w:rsid w:val="004B0894"/>
@@ -6033,11 +5905,11 @@
       <w:color w:val="2F5496" w:themeColor="accent1" w:themeShade="BF"/>
     </w:rPr>
   </w:style>
-  <w:style w:type="paragraph" w:styleId="a9">
+  <w:style w:type="paragraph" w:styleId="IntenseQuote">
     <w:name w:val="Intense Quote"/>
-    <w:basedOn w:val="a"/>
-    <w:next w:val="a"/>
-    <w:link w:val="aa"/>
+    <w:basedOn w:val="Normal"/>
+    <w:next w:val="Normal"/>
+    <w:link w:val="IntenseQuoteChar"/>
     <w:uiPriority w:val="30"/>
     <w:qFormat/>
     <w:rsid w:val="004B0894"/>
@@ -6062,10 +5934,10 @@
       <w14:ligatures w14:val="standardContextual"/>
     </w:rPr>
   </w:style>
-  <w:style w:type="character" w:customStyle="1" w:styleId="aa">
-    <w:name w:val="Выделенная цитата Знак"/>
-    <w:basedOn w:val="a0"/>
-    <w:link w:val="a9"/>
+  <w:style w:type="character" w:customStyle="1" w:styleId="IntenseQuoteChar">
+    <w:name w:val="Intense Quote Char"/>
+    <w:basedOn w:val="DefaultParagraphFont"/>
+    <w:link w:val="IntenseQuote"/>
     <w:uiPriority w:val="30"/>
     <w:rsid w:val="004B0894"/>
     <w:rPr>
@@ -6074,9 +5946,9 @@
       <w:color w:val="2F5496" w:themeColor="accent1" w:themeShade="BF"/>
     </w:rPr>
   </w:style>
-  <w:style w:type="character" w:styleId="ab">
+  <w:style w:type="character" w:styleId="IntenseReference">
     <w:name w:val="Intense Reference"/>
-    <w:basedOn w:val="a0"/>
+    <w:basedOn w:val="DefaultParagraphFont"/>
     <w:uiPriority w:val="32"/>
     <w:qFormat/>
     <w:rsid w:val="004B0894"/>
@@ -6088,10 +5960,10 @@
       <w:spacing w:val="5"/>
     </w:rPr>
   </w:style>
-  <w:style w:type="paragraph" w:styleId="23">
+  <w:style w:type="paragraph" w:styleId="BodyText2">
     <w:name w:val="Body Text 2"/>
-    <w:basedOn w:val="a"/>
-    <w:link w:val="24"/>
+    <w:basedOn w:val="Normal"/>
+    <w:link w:val="BodyText2Char"/>
     <w:rsid w:val="004B0894"/>
     <w:pPr>
       <w:tabs>
@@ -6108,10 +5980,10 @@
       <w:sz w:val="28"/>
     </w:rPr>
   </w:style>
-  <w:style w:type="character" w:customStyle="1" w:styleId="24">
-    <w:name w:val="Основной текст 2 Знак"/>
-    <w:basedOn w:val="a0"/>
-    <w:link w:val="23"/>
+  <w:style w:type="character" w:customStyle="1" w:styleId="BodyText2Char">
+    <w:name w:val="Body Text 2 Char"/>
+    <w:basedOn w:val="DefaultParagraphFont"/>
+    <w:link w:val="BodyText2"/>
     <w:rsid w:val="004B0894"/>
     <w:rPr>
       <w:rFonts w:ascii="Times New Roman" w:eastAsia="Batang" w:hAnsi="Times New Roman" w:cs="Times New Roman"/>
@@ -6122,9 +5994,9 @@
       <w14:ligatures w14:val="none"/>
     </w:rPr>
   </w:style>
-  <w:style w:type="table" w:styleId="ac">
+  <w:style w:type="table" w:styleId="TableGrid">
     <w:name w:val="Table Grid"/>
-    <w:basedOn w:val="a1"/>
+    <w:basedOn w:val="TableNormal"/>
     <w:uiPriority w:val="39"/>
     <w:rsid w:val="004B0894"/>
     <w:pPr>

</xml_diff>